<commit_message>
2.0.3 Limpieza de datos
Se arreglan problemas con la limpieza y estandarización de datos
</commit_message>
<xml_diff>
--- a/docs/Encargo 1 - Visualizacion de datos.docx
+++ b/docs/Encargo 1 - Visualizacion de datos.docx
@@ -826,7 +826,7 @@
     </w:p>
     <w:sdt>
       <w:sdtPr>
-        <w:id w:val="669850284"/>
+        <w:id w:val="-1580062128"/>
         <w:docPartObj>
           <w:docPartGallery w:val="Table of Contents"/>
           <w:docPartUnique w:val="1"/>
@@ -2401,29 +2401,29 @@
         <w:rPr>
           <w:rtl w:val="0"/>
         </w:rPr>
-        <w:t xml:space="preserve">StreamView Analytics es un proyecto de visualización de datos orientado a analizar el catálogo audiovisual de Netflix con el objetivo de transformar información dispersa en conocimiento útil para la toma de decisiones. El conjunto de datos reúne información sobre películas y series, incluyendo géneros, países, idiomas, popularidad, fechas de lanzamiento y, en algunos casos, métricas financieras. Esta diversidad de variables permite estudiar el catálogo desde una perspectiva estratégica, tanto de contenido como de negocio.</w:t>
-      </w:r>
-    </w:p>
-    <w:p>
-      <w:pPr>
-        <w:rPr/>
-      </w:pPr>
-      <w:r>
-        <w:rPr>
-          <w:rtl w:val="0"/>
-        </w:rPr>
-        <w:t xml:space="preserve">El problema principal radica en que el catálogo, aunque está disponible, no está organizado ni estructurado de forma que permita interpretarlo de manera ágil y comprensible para distintos perfiles de usuario. Además, la información se presenta en formatos heterogéneos y con distintas características entre películas y series, lo que dificulta su comparación y análisis. Por ello, el proyecto propone una limpieza y normalización de los datos para crear una base unificada y consistente, sobre la que se puedan generar indicadores y visualizaciones útiles.</w:t>
-      </w:r>
-    </w:p>
-    <w:p>
-      <w:pPr>
-        <w:rPr/>
-      </w:pPr>
-      <w:r>
-        <w:rPr>
-          <w:rtl w:val="0"/>
-        </w:rPr>
-        <w:t xml:space="preserve">El objetivo del proyecto es desarrollar una solución de visual analytics que permita entender mejor la composición del catálogo, detectar patrones relevantes y apoyar la toma de decisiones en áreas como contenido, marketing y estrategia comercial. A través del análisis exploratorio y la visualización de datos, se busca identificar tendencias por género, país, idioma, tipo de contenido y evolución temporal, además de evaluar la relevancia del catálogo desde una perspectiva de negocio. En definitiva, el proyecto combina datos, análisis y visualización para convertir la información audiovisual en una herramienta de apoyo para la gestión y la planificación estratégica.</w:t>
+        <w:t xml:space="preserve">StreamView Analytics es un proyecto de visualización de datos orientado a analizar el catálogo audiovisual de Netflix, el proyecto tiene el objetivo de transformar información dispersa en diferentes datasets en conocimiento útil para la toma de decisiones. El conjunto de datos reúne información sobre películas y series, incluyendo sus géneros, países, idiomas, popularidad, fechas de lanzamiento y métricas financieras en algunos casos. Esta diversidad de variables permite estudiar el catálogo desde una perspectiva estratégica, tanto de contenido como de negocio.</w:t>
+      </w:r>
+    </w:p>
+    <w:p>
+      <w:pPr>
+        <w:rPr/>
+      </w:pPr>
+      <w:r>
+        <w:rPr>
+          <w:rtl w:val="0"/>
+        </w:rPr>
+        <w:t xml:space="preserve">El problema principal radica en que el catálogo, aunque está disponible, no está organizado ni estructurado de forma que permita interpretarlo de manera ágil y comprensible para distintos perfiles de usuario. Además, la información se presenta en formatos heterogéneos con distintas características entre películas y series, lo que dificulta su análisis. Por ello, el proyecto propone una limpieza y normalización de los datos para crear una base unificada consistente, sobre la que se puedan generar visualizaciones útiles para los diferentes tipos de audiencia.</w:t>
+      </w:r>
+    </w:p>
+    <w:p>
+      <w:pPr>
+        <w:rPr/>
+      </w:pPr>
+      <w:r>
+        <w:rPr>
+          <w:rtl w:val="0"/>
+        </w:rPr>
+        <w:t xml:space="preserve">El objetivo del proyecto es desarrollar una solución de visual analytics que permita entender mejor la composición del catálogo, detectar patrones relevantes, apoyando la toma de decisiones en áreas como contenido, marketing y estrategia comercial. A través del análisis exploratorio y la visualización de datos, se busca identificar tendencias por género, país, idioma, tipo de contenido y evolución temporal, además de evaluar la relevancia del catálogo desde una perspectiva de negocio. En definitiva, el proyecto combina datos, análisis y visualización para convertir la información audiovisual en una herramienta de apoyo para la gestión y la planificación estratégica.</w:t>
       </w:r>
     </w:p>
     <w:p>
@@ -2509,17 +2509,18 @@
           <w:rtl w:val="0"/>
         </w:rPr>
         <w:t xml:space="preserve">StreamView Analytics es una organización dedicada a la distribución de contenido audiovisual mediante una plataforma de streaming. Su catálogo incluye películas y series de distintos países, idiomas y géneros, así como información asociada a popularidad, valoración del público y, en algunos casos, datos financieros de las producciones.</w:t>
-      </w:r>
-    </w:p>
-    <w:p>
-      <w:pPr>
-        <w:rPr/>
-      </w:pPr>
-      <w:r>
-        <w:rPr>
-          <w:rtl w:val="0"/>
-        </w:rPr>
-        <w:t xml:space="preserve">El crecimiento del catálogo ha incrementado la cantidad y diversidad de información disponible, pero la organización todavía no cuenta con una visión consolidada que permita interpretar de manera integral el comportamiento del contenido. La información se maneja de forma fragmentada entre distintas áreas y análisis aislados, lo que dificulta comparar categorías, identificar tendencias y apoyar decisiones relacionadas con la adquisición, gestión y promoción del contenido.</w:t>
+        <w:tab/>
+      </w:r>
+    </w:p>
+    <w:p>
+      <w:pPr>
+        <w:rPr/>
+      </w:pPr>
+      <w:r>
+        <w:rPr>
+          <w:rtl w:val="0"/>
+        </w:rPr>
+        <w:t xml:space="preserve">El crecimiento del catálogo ha incrementado la cantidad y diversidad de información disponible, pero la organización todavía no cuenta con una visión consolidada que permita interpretar de manera integral el comportamiento del contenido. La información se maneja de forma fragmentada entre distintas áreas con análisis aislados, lo que dificulta comparar categorías, identificar tendencias y apoyar decisiones relacionadas con la adquisición, gestión y promoción del contenido.</w:t>
       </w:r>
     </w:p>
     <w:p>
@@ -2555,82 +2556,18 @@
         <w:rPr>
           <w:rtl w:val="0"/>
         </w:rPr>
-        <w:t xml:space="preserve">Si bien StreamView Analytics dispone de información relevante sobre su catálogo audiovisual, esta se encuentra distribuida en reportes y análisis aislados utilizados por distintas áreas de la organización. Como consecuencia, no existe una visión consolidada del catálogo que facilite la identificación de tendencias, la comparación entre contenidos y la comunicación de hallazgos relevantes para la toma de decisiones.</w:t>
-      </w:r>
-    </w:p>
-    <w:p>
-      <w:pPr>
-        <w:rPr/>
-      </w:pPr>
-      <w:r>
-        <w:rPr>
-          <w:rtl w:val="0"/>
-        </w:rPr>
-        <w:t xml:space="preserve">El problema de negocio se centra en la dificultad de transformar los datos disponibles del catálogo en información clara, integrada y comprensible. Esta limitación afecta la capacidad de la organización para evaluar el rendimiento del contenido, analizar patrones de consumo, identificar oportunidades de crecimiento y apoyar decisiones estratégicas relacionadas con la adquisición, promoción y posicionamiento de contenidos.</w:t>
-      </w:r>
-    </w:p>
-    <w:p>
-      <w:pPr>
-        <w:rPr/>
-      </w:pPr>
-      <w:r>
-        <w:rPr>
-          <w:rtl w:val="0"/>
-        </w:rPr>
-        <w:t xml:space="preserve">A partir de este diagnóstico, el proyecto se orienta a desarrollar una solución de Visual Analytics que permita reducir esta brecha entre la disponibilidad de información y su uso efectivo como apoyo para la toma de decisiones en áreas clave de la empresa.</w:t>
-      </w:r>
-    </w:p>
-    <w:p>
-      <w:pPr>
-        <w:pStyle w:val="Heading1"/>
-        <w:rPr/>
-      </w:pPr>
-      <w:bookmarkStart w:colFirst="0" w:colLast="0" w:name="_45ahgb9xyyux" w:id="7"/>
-      <w:bookmarkEnd w:id="7"/>
-      <w:r>
-        <w:rPr>
-          <w:rtl w:val="0"/>
-        </w:rPr>
-        <w:t xml:space="preserve">3. Objetivos del proyecto</w:t>
-      </w:r>
-    </w:p>
-    <w:p>
-      <w:pPr>
-        <w:pStyle w:val="Heading2"/>
-        <w:rPr/>
-      </w:pPr>
-      <w:bookmarkStart w:colFirst="0" w:colLast="0" w:name="_8r6mnlxsjc4t" w:id="10"/>
-      <w:bookmarkEnd w:id="10"/>
-      <w:r>
-        <w:rPr>
-          <w:rtl w:val="0"/>
-        </w:rPr>
-        <w:t xml:space="preserve">3.1 Objetivo general</w:t>
-      </w:r>
-    </w:p>
-    <w:p>
-      <w:pPr>
-        <w:rPr/>
-      </w:pPr>
-      <w:r>
-        <w:rPr>
-          <w:rtl w:val="0"/>
-        </w:rPr>
-        <w:t xml:space="preserve">Analizar y comunicar visualmente las principales características del catálogo audiovisual de StreamView Analytics mediante una solución de Visual Analytics que integre información de películas y series, con el propósito de identificar patrones, tendencias y oportunidades relevantes. Esta propuesta busca facilitar la comprensión del catálogo y apoyar la toma de decisiones estratégicas relacionadas con la gestión, promoción y evolución del contenido.</w:t>
-      </w:r>
-    </w:p>
-    <w:p>
-      <w:pPr>
-        <w:pStyle w:val="Heading2"/>
-        <w:rPr/>
-      </w:pPr>
-      <w:bookmarkStart w:colFirst="0" w:colLast="0" w:name="_kj5q6g9c6wie" w:id="11"/>
-      <w:bookmarkEnd w:id="11"/>
-      <w:r>
-        <w:rPr>
-          <w:rtl w:val="0"/>
-        </w:rPr>
-        <w:t xml:space="preserve">3.2 Objetivos específicos</w:t>
+        <w:t xml:space="preserve">El problema de negocio consiste en que StreamView no cuenta con una visión consolidada, clara y fácilmente interpretable de su catálogo audiovisual. La información disponible puede ser utilizada para análisis, pero requiere un proceso previo de integración, validación y organización.</w:t>
+      </w:r>
+    </w:p>
+    <w:p>
+      <w:pPr>
+        <w:rPr/>
+      </w:pPr>
+      <w:r>
+        <w:rPr>
+          <w:rtl w:val="0"/>
+        </w:rPr>
+        <w:t xml:space="preserve">Esta limitación dificulta responder preguntas como:</w:t>
       </w:r>
     </w:p>
     <w:p>
@@ -2649,7 +2586,7 @@
         <w:rPr>
           <w:rtl w:val="0"/>
         </w:rPr>
-        <w:t xml:space="preserve">Integrar la información disponible de películas y series para obtener una visión consolidada del catálogo audiovisual de StreamView Analytics.</w:t>
+        <w:t xml:space="preserve">¿Qué tipos de contenidos componen el catálogo?</w:t>
       </w:r>
     </w:p>
     <w:p>
@@ -2668,7 +2605,7 @@
         <w:rPr>
           <w:rtl w:val="0"/>
         </w:rPr>
-        <w:t xml:space="preserve">Caracterizar el catálogo considerando variables relevantes como tipo de contenido, género, país, idioma, clasificación y evolución temporal.</w:t>
+        <w:t xml:space="preserve">¿Qué géneros, países e idiomas tienen mayor presencia?</w:t>
       </w:r>
     </w:p>
     <w:p>
@@ -2687,7 +2624,7 @@
         <w:rPr>
           <w:rtl w:val="0"/>
         </w:rPr>
-        <w:t xml:space="preserve">Analizar indicadores de popularidad y valoración para identificar contenidos y segmentos con comportamientos relevantes para la organización.</w:t>
+        <w:t xml:space="preserve">¿Qué contenidos presentan mayor popularidad relativa?</w:t>
       </w:r>
     </w:p>
     <w:p>
@@ -2706,7 +2643,26 @@
         <w:rPr>
           <w:rtl w:val="0"/>
         </w:rPr>
-        <w:t xml:space="preserve">Comunicar los principales hallazgos mediante visualizaciones y una narrativa visual adaptada a las necesidades de información de las audiencias definidas.</w:t>
+        <w:t xml:space="preserve">¿La popularidad coincide con una valoración favorable?</w:t>
+      </w:r>
+    </w:p>
+    <w:p>
+      <w:pPr>
+        <w:numPr>
+          <w:ilvl w:val="0"/>
+          <w:numId w:val="2"/>
+        </w:numPr>
+        <w:spacing w:after="0" w:afterAutospacing="0" w:before="0" w:beforeAutospacing="0"/>
+        <w:ind w:left="720" w:hanging="360"/>
+        <w:rPr>
+          <w:u w:val="none"/>
+        </w:rPr>
+      </w:pPr>
+      <w:r>
+        <w:rPr>
+          <w:rtl w:val="0"/>
+        </w:rPr>
+        <w:t xml:space="preserve">¿Qué segmentos podrían estudiarse para futuras adquisiciones o campañas?</w:t>
       </w:r>
     </w:p>
     <w:p>
@@ -2725,18 +2681,29 @@
         <w:rPr>
           <w:rtl w:val="0"/>
         </w:rPr>
-        <w:t xml:space="preserve">Establecer una base analítica útil para la comparación entre contenidos, la identificación de tendencias y la toma de decisiones estratégicas.</w:t>
-      </w:r>
-    </w:p>
-    <w:p>
-      <w:pPr>
-        <w:rPr/>
-      </w:pPr>
-      <w:r>
-        <w:rPr>
-          <w:rtl w:val="0"/>
-        </w:rPr>
-        <w:t xml:space="preserve">El cumplimiento de estos objetivos requiere considerar que las decisiones apoyadas por la solución no corresponden a un único nivel organizacional. Por esta razón, resulta necesario identificar las principales audiencias involucradas y comprender sus necesidades específicas de información para diseñar análisis y visualizaciones con un valor práctico real.</w:t>
+        <w:t xml:space="preserve">¿Qué decisiones pueden apoyarse con la información disponible?</w:t>
+      </w:r>
+    </w:p>
+    <w:p>
+      <w:pPr>
+        <w:rPr/>
+      </w:pPr>
+      <w:r>
+        <w:rPr>
+          <w:rtl w:val="0"/>
+        </w:rPr>
+        <w:t xml:space="preserve">Es importante aclarar que el dataset no contiene reproducciones, usuarios, retención ni consumo directo. Por lo tanto, el análisis no mide la audiencia real de StreamView. La variable popularity se utiliza únicamente como un índice relativo disponible en la fuente.</w:t>
+      </w:r>
+    </w:p>
+    <w:p>
+      <w:pPr>
+        <w:rPr/>
+      </w:pPr>
+      <w:r>
+        <w:rPr>
+          <w:rtl w:val="0"/>
+        </w:rPr>
+        <w:t xml:space="preserve">En respuesta a este problema, el proyecto propone integrar y analizar la información del catálogo mediante una solución de Visual Analytics. El objetivo es transformar datos heterogéneos en indicadores, comparaciones y visualizaciones que faciliten la interpretación del catálogo apoyando decisiones de contenido, adquisición y marketing.</w:t>
       </w:r>
     </w:p>
     <w:p>
@@ -2750,6 +2717,214 @@
         <w:rPr>
           <w:rtl w:val="0"/>
         </w:rPr>
+        <w:t xml:space="preserve">3. Objetivos del proyecto</w:t>
+      </w:r>
+    </w:p>
+    <w:p>
+      <w:pPr>
+        <w:pStyle w:val="Heading2"/>
+        <w:rPr/>
+      </w:pPr>
+      <w:bookmarkStart w:colFirst="0" w:colLast="0" w:name="_8r6mnlxsjc4t" w:id="10"/>
+      <w:bookmarkEnd w:id="10"/>
+      <w:r>
+        <w:rPr>
+          <w:rtl w:val="0"/>
+        </w:rPr>
+        <w:t xml:space="preserve">3.1 Objetivo general</w:t>
+      </w:r>
+    </w:p>
+    <w:p>
+      <w:pPr>
+        <w:rPr/>
+      </w:pPr>
+      <w:r>
+        <w:rPr>
+          <w:rtl w:val="0"/>
+        </w:rPr>
+        <w:t xml:space="preserve">Analizar y comunicar visualmente las principales características del catálogo audiovisual de StreamView Analytics mediante una solución de Visual Analytics que integre información de películas y series, con el propósito de identificar patrones, tendencias y oportunidades relevantes. Esta propuesta busca facilitar la comprensión del catálogo y apoyar la toma de decisiones estratégicas relacionadas con la gestión, promoción y evolución del contenido.</w:t>
+      </w:r>
+    </w:p>
+    <w:p>
+      <w:pPr>
+        <w:pStyle w:val="Heading2"/>
+        <w:rPr/>
+      </w:pPr>
+      <w:bookmarkStart w:colFirst="0" w:colLast="0" w:name="_kj5q6g9c6wie" w:id="11"/>
+      <w:bookmarkEnd w:id="11"/>
+      <w:r>
+        <w:rPr>
+          <w:rtl w:val="0"/>
+        </w:rPr>
+        <w:t xml:space="preserve">3.2 Objetivos específicos</w:t>
+      </w:r>
+    </w:p>
+    <w:p>
+      <w:pPr>
+        <w:numPr>
+          <w:ilvl w:val="0"/>
+          <w:numId w:val="6"/>
+        </w:numPr>
+        <w:spacing w:after="0" w:afterAutospacing="0"/>
+        <w:ind w:left="720" w:hanging="360"/>
+      </w:pPr>
+      <w:r>
+        <w:rPr>
+          <w:rtl w:val="0"/>
+        </w:rPr>
+        <w:t xml:space="preserve">Integrar las fuentes de películas y series en un dataset consolidado, manteniendo la distinción entre ambos tipos de contenido.</w:t>
+      </w:r>
+    </w:p>
+    <w:p>
+      <w:pPr>
+        <w:numPr>
+          <w:ilvl w:val="0"/>
+          <w:numId w:val="6"/>
+        </w:numPr>
+        <w:spacing w:after="0" w:afterAutospacing="0" w:before="0" w:beforeAutospacing="0"/>
+        <w:ind w:left="720" w:hanging="360"/>
+      </w:pPr>
+      <w:r>
+        <w:rPr>
+          <w:rtl w:val="0"/>
+        </w:rPr>
+        <w:t xml:space="preserve">Validar la estructura, los tipos de datos, los valores faltantes, los rangos válidos y los registros repetidos antes de realizar el análisis.</w:t>
+      </w:r>
+    </w:p>
+    <w:p>
+      <w:pPr>
+        <w:numPr>
+          <w:ilvl w:val="0"/>
+          <w:numId w:val="6"/>
+        </w:numPr>
+        <w:spacing w:after="0" w:afterAutospacing="0" w:before="0" w:beforeAutospacing="0"/>
+        <w:ind w:left="720" w:hanging="360"/>
+      </w:pPr>
+      <w:r>
+        <w:rPr>
+          <w:rtl w:val="0"/>
+        </w:rPr>
+        <w:t xml:space="preserve">Caracterizar el catálogo considerando tipo de contenido, género, país, idioma, año de lanzamiento y año de incorporación al catálogo.</w:t>
+      </w:r>
+    </w:p>
+    <w:p>
+      <w:pPr>
+        <w:numPr>
+          <w:ilvl w:val="0"/>
+          <w:numId w:val="6"/>
+        </w:numPr>
+        <w:spacing w:after="0" w:afterAutospacing="0" w:before="0" w:beforeAutospacing="0"/>
+        <w:ind w:left="720" w:hanging="360"/>
+      </w:pPr>
+      <w:r>
+        <w:rPr>
+          <w:rtl w:val="0"/>
+        </w:rPr>
+        <w:t xml:space="preserve">Analizar los contenidos mediante las variables popularity, vote_average y vote_count, diferenciando entre interés relativo, valoración promedio y respaldo de las evaluaciones.</w:t>
+      </w:r>
+    </w:p>
+    <w:p>
+      <w:pPr>
+        <w:numPr>
+          <w:ilvl w:val="0"/>
+          <w:numId w:val="6"/>
+        </w:numPr>
+        <w:spacing w:after="0" w:afterAutospacing="0" w:before="0" w:beforeAutospacing="0"/>
+        <w:ind w:left="720" w:hanging="360"/>
+      </w:pPr>
+      <w:r>
+        <w:rPr>
+          <w:rtl w:val="0"/>
+        </w:rPr>
+        <w:t xml:space="preserve">Identificar concentraciones y posibles oportunidades de análisis en géneros, países e idiomas con distinta presencia dentro del catálogo.</w:t>
+      </w:r>
+    </w:p>
+    <w:p>
+      <w:pPr>
+        <w:numPr>
+          <w:ilvl w:val="0"/>
+          <w:numId w:val="6"/>
+        </w:numPr>
+        <w:spacing w:after="0" w:afterAutospacing="0" w:before="0" w:beforeAutospacing="0"/>
+        <w:ind w:left="720" w:hanging="360"/>
+      </w:pPr>
+      <w:r>
+        <w:rPr>
+          <w:rtl w:val="0"/>
+        </w:rPr>
+        <w:t xml:space="preserve">Analizar las variables financieras budget y revenue únicamente para películas que cuentan con información completa, evitando interpretar valores faltantes como ceros.</w:t>
+      </w:r>
+    </w:p>
+    <w:p>
+      <w:pPr>
+        <w:numPr>
+          <w:ilvl w:val="0"/>
+          <w:numId w:val="6"/>
+        </w:numPr>
+        <w:spacing w:after="0" w:afterAutospacing="0" w:before="0" w:beforeAutospacing="0"/>
+        <w:ind w:left="720" w:hanging="360"/>
+      </w:pPr>
+      <w:r>
+        <w:rPr>
+          <w:rtl w:val="0"/>
+        </w:rPr>
+        <w:t xml:space="preserve">Diseñar visualizaciones interactivas que permitan comparar películas y series, explorar rankings, observar incorporaciones por año y analizar la relación entre popularidad y valoración.</w:t>
+      </w:r>
+    </w:p>
+    <w:p>
+      <w:pPr>
+        <w:numPr>
+          <w:ilvl w:val="0"/>
+          <w:numId w:val="6"/>
+        </w:numPr>
+        <w:spacing w:after="0" w:afterAutospacing="0" w:before="0" w:beforeAutospacing="0"/>
+        <w:ind w:left="720" w:hanging="360"/>
+      </w:pPr>
+      <w:r>
+        <w:rPr>
+          <w:rtl w:val="0"/>
+        </w:rPr>
+        <w:t xml:space="preserve">Proponer una estructura de dashboard orientada a las necesidades del Directorio, la Gerencia de Contenidos y Adquisición y la Gerencia de Marketing.</w:t>
+      </w:r>
+    </w:p>
+    <w:p>
+      <w:pPr>
+        <w:numPr>
+          <w:ilvl w:val="0"/>
+          <w:numId w:val="6"/>
+        </w:numPr>
+        <w:spacing w:before="0" w:beforeAutospacing="0"/>
+        <w:ind w:left="720" w:hanging="360"/>
+      </w:pPr>
+      <w:r>
+        <w:rPr>
+          <w:rtl w:val="0"/>
+        </w:rPr>
+        <w:t xml:space="preserve">Comunicar los hallazgos mediante una narrativa visual clara, evitando presentar los indicadores disponibles como medidas directas de consumo o audiencia.</w:t>
+      </w:r>
+    </w:p>
+    <w:p>
+      <w:pPr>
+        <w:rPr/>
+      </w:pPr>
+      <w:r>
+        <w:rPr>
+          <w:rtl w:val="0"/>
+        </w:rPr>
+        <w:t xml:space="preserve">El cumplimiento de estos objetivos requiere considerar que las decisiones apoyadas por la solución no corresponden a un único nivel organizacional. Por esta razón, resulta necesario identificar las principales audiencias involucradas y comprender sus necesidades específicas de información para diseñar análisis y visualizaciones con un valor práctico real.</w:t>
+      </w:r>
+    </w:p>
+    <w:p>
+      <w:pPr>
+        <w:pStyle w:val="Heading1"/>
+        <w:rPr/>
+      </w:pPr>
+      <w:bookmarkStart w:colFirst="0" w:colLast="0" w:name="_45ahgb9xyyux" w:id="7"/>
+      <w:bookmarkEnd w:id="7"/>
+      <w:r>
+        <w:rPr>
+          <w:rtl w:val="0"/>
+        </w:rPr>
         <w:t xml:space="preserve">4. Audiencia objetivo y propósito comunicacional</w:t>
       </w:r>
     </w:p>
@@ -2777,99 +2952,6 @@
           <w:rtl w:val="0"/>
         </w:rPr>
         <w:t xml:space="preserve">El proyecto está orientado a distintos perfiles de usuarios dentro de la organización, cada uno con necesidades específicas de análisis y niveles distintos de detalle. Por ello, resulta fundamental identificar a las audiencias que utilizarán la solución y comprender cuáles son sus principales requerimientos de información. Esta segmentación permite diseñar una comunicación más efectiva, ajustando el nivel de síntesis, profundidad analítica y enfoque visual según el tipo de decisión que cada grupo de usuarios debe tomar.</w:t>
-      </w:r>
-    </w:p>
-    <w:p>
-      <w:pPr>
-        <w:spacing w:after="240" w:before="240" w:lineRule="auto"/>
-        <w:ind w:right="600"/>
-        <w:rPr>
-          <w:b w:val="1"/>
-          <w:bCs w:val="1"/>
-        </w:rPr>
-      </w:pPr>
-      <w:r>
-        <w:rPr>
-          <w:b w:val="1"/>
-          <w:bCs w:val="1"/>
-          <w:rtl w:val="0"/>
-        </w:rPr>
-        <w:t xml:space="preserve">Directorio</w:t>
-      </w:r>
-    </w:p>
-    <w:p>
-      <w:pPr>
-        <w:spacing w:after="240" w:before="240" w:lineRule="auto"/>
-        <w:ind w:right="600"/>
-        <w:rPr/>
-      </w:pPr>
-      <w:r>
-        <w:rPr>
-          <w:rtl w:val="0"/>
-        </w:rPr>
-        <w:t xml:space="preserve">El Directorio requiere una visión ejecutiva y consolidada del catálogo que permita comprender de manera rápida su composición, tendencias principales y oportunidades estratégicas. Debido a su nivel de decisión, necesita indicadores resumidos, conclusiones relevantes y una interpretación general del negocio que facilite la evaluación del estado del catálogo y su potencial.</w:t>
-      </w:r>
-    </w:p>
-    <w:p>
-      <w:pPr>
-        <w:spacing w:after="240" w:before="240" w:lineRule="auto"/>
-        <w:ind w:right="600"/>
-        <w:rPr>
-          <w:b w:val="1"/>
-          <w:bCs w:val="1"/>
-        </w:rPr>
-      </w:pPr>
-      <w:r>
-        <w:rPr>
-          <w:b w:val="1"/>
-          <w:bCs w:val="1"/>
-          <w:rtl w:val="0"/>
-        </w:rPr>
-        <w:t xml:space="preserve">Gerencia de Contenidos y Adquisición</w:t>
-      </w:r>
-    </w:p>
-    <w:p>
-      <w:pPr>
-        <w:spacing w:after="240" w:before="240" w:lineRule="auto"/>
-        <w:ind w:right="600"/>
-        <w:rPr/>
-      </w:pPr>
-      <w:r>
-        <w:rPr>
-          <w:rtl w:val="0"/>
-        </w:rPr>
-        <w:t xml:space="preserve">La Gerencia de Contenidos y Adquisición necesita información más detallada para identificar géneros, países y contenidos con características relevantes en términos de popularidad, valoración y presencia dentro del catálogo. Esta información puede apoyar decisiones relacionadas con la adquisición, renovación y posicionamiento del contenido.</w:t>
-      </w:r>
-    </w:p>
-    <w:p>
-      <w:pPr>
-        <w:spacing w:after="240" w:before="240" w:lineRule="auto"/>
-        <w:ind w:right="600"/>
-        <w:rPr>
-          <w:b w:val="1"/>
-          <w:bCs w:val="1"/>
-        </w:rPr>
-      </w:pPr>
-      <w:r>
-        <w:rPr>
-          <w:b w:val="1"/>
-          <w:bCs w:val="1"/>
-          <w:rtl w:val="0"/>
-        </w:rPr>
-        <w:t xml:space="preserve">Gerencia de Marketing</w:t>
-      </w:r>
-    </w:p>
-    <w:p>
-      <w:pPr>
-        <w:spacing w:after="240" w:before="240" w:lineRule="auto"/>
-        <w:ind w:right="600"/>
-        <w:rPr/>
-      </w:pPr>
-      <w:r>
-        <w:rPr>
-          <w:rtl w:val="0"/>
-        </w:rPr>
-        <w:t xml:space="preserve">La Gerencia de Marketing requiere información orientada a detectar contenidos y categorías con potencial para campañas de promoción, posicionamiento y comunicación comercial. Para ello, necesita análisis de popularidad, valoración, tendencias del catálogo y atributos relevantes de los contenidos que permitan orientar decisiones comunicacionales y de mercadeo.</w:t>
       </w:r>
     </w:p>
     <w:tbl>
@@ -3333,6 +3415,519 @@
     </w:p>
     <w:p>
       <w:pPr>
+        <w:spacing w:after="240" w:before="240" w:lineRule="auto"/>
+        <w:ind w:right="600"/>
+        <w:rPr>
+          <w:b w:val="1"/>
+          <w:bCs w:val="1"/>
+        </w:rPr>
+      </w:pPr>
+      <w:r>
+        <w:rPr>
+          <w:b w:val="1"/>
+          <w:bCs w:val="1"/>
+          <w:rtl w:val="0"/>
+        </w:rPr>
+        <w:t xml:space="preserve">Directorio</w:t>
+      </w:r>
+    </w:p>
+    <w:p>
+      <w:pPr>
+        <w:spacing w:after="240" w:before="240" w:lineRule="auto"/>
+        <w:ind w:right="600"/>
+        <w:rPr/>
+      </w:pPr>
+      <w:r>
+        <w:rPr>
+          <w:rtl w:val="0"/>
+        </w:rPr>
+        <w:t xml:space="preserve">El Directorio requiere una visión ejecutiva y consolidada del catálogo que permita comprender de manera rápida su composición, tendencias principales y oportunidades estratégicas. Debido a su nivel de decisión, necesita indicadores resumidos, conclusiones relevantes y una interpretación general del negocio que facilite la evaluación del estado del catálogo y su potencial.</w:t>
+      </w:r>
+    </w:p>
+    <w:p>
+      <w:pPr>
+        <w:spacing w:after="240" w:before="240" w:lineRule="auto"/>
+        <w:ind w:right="600"/>
+        <w:rPr/>
+      </w:pPr>
+      <w:r>
+        <w:rPr>
+          <w:rtl w:val="0"/>
+        </w:rPr>
+        <w:t xml:space="preserve">La información más relevante para esta audiencia incluye:</w:t>
+      </w:r>
+    </w:p>
+    <w:p>
+      <w:pPr>
+        <w:numPr>
+          <w:ilvl w:val="0"/>
+          <w:numId w:val="3"/>
+        </w:numPr>
+        <w:spacing w:after="0" w:afterAutospacing="0" w:before="240" w:lineRule="auto"/>
+        <w:ind w:left="720" w:right="600" w:hanging="360"/>
+        <w:rPr>
+          <w:u w:val="none"/>
+        </w:rPr>
+      </w:pPr>
+      <w:r>
+        <w:rPr>
+          <w:rtl w:val="0"/>
+        </w:rPr>
+        <w:t xml:space="preserve">cantidad total de contenidos;</w:t>
+      </w:r>
+    </w:p>
+    <w:p>
+      <w:pPr>
+        <w:numPr>
+          <w:ilvl w:val="0"/>
+          <w:numId w:val="3"/>
+        </w:numPr>
+        <w:spacing w:after="0" w:afterAutospacing="0" w:before="0" w:beforeAutospacing="0" w:lineRule="auto"/>
+        <w:ind w:left="720" w:right="600" w:hanging="360"/>
+        <w:rPr>
+          <w:u w:val="none"/>
+        </w:rPr>
+      </w:pPr>
+      <w:r>
+        <w:rPr>
+          <w:rtl w:val="0"/>
+        </w:rPr>
+        <w:t xml:space="preserve">proporción entre películas y series;</w:t>
+      </w:r>
+    </w:p>
+    <w:p>
+      <w:pPr>
+        <w:numPr>
+          <w:ilvl w:val="0"/>
+          <w:numId w:val="3"/>
+        </w:numPr>
+        <w:spacing w:after="0" w:afterAutospacing="0" w:before="0" w:beforeAutospacing="0" w:lineRule="auto"/>
+        <w:ind w:left="720" w:right="600" w:hanging="360"/>
+        <w:rPr>
+          <w:u w:val="none"/>
+        </w:rPr>
+      </w:pPr>
+      <w:r>
+        <w:rPr>
+          <w:rtl w:val="0"/>
+        </w:rPr>
+        <w:t xml:space="preserve">cobertura por países, idiomas y géneros;</w:t>
+      </w:r>
+    </w:p>
+    <w:p>
+      <w:pPr>
+        <w:numPr>
+          <w:ilvl w:val="0"/>
+          <w:numId w:val="3"/>
+        </w:numPr>
+        <w:spacing w:after="0" w:afterAutospacing="0" w:before="0" w:beforeAutospacing="0" w:lineRule="auto"/>
+        <w:ind w:left="720" w:right="600" w:hanging="360"/>
+        <w:rPr>
+          <w:u w:val="none"/>
+        </w:rPr>
+      </w:pPr>
+      <w:r>
+        <w:rPr>
+          <w:rtl w:val="0"/>
+        </w:rPr>
+        <w:t xml:space="preserve">indicadores generales de valoración y popularidad;</w:t>
+      </w:r>
+    </w:p>
+    <w:p>
+      <w:pPr>
+        <w:numPr>
+          <w:ilvl w:val="0"/>
+          <w:numId w:val="3"/>
+        </w:numPr>
+        <w:spacing w:after="0" w:afterAutospacing="0" w:before="0" w:beforeAutospacing="0" w:lineRule="auto"/>
+        <w:ind w:left="720" w:right="600" w:hanging="360"/>
+        <w:rPr>
+          <w:u w:val="none"/>
+        </w:rPr>
+      </w:pPr>
+      <w:r>
+        <w:rPr>
+          <w:rtl w:val="0"/>
+        </w:rPr>
+        <w:t xml:space="preserve">disponibilidad y limitaciones de las variables financieras;</w:t>
+      </w:r>
+    </w:p>
+    <w:p>
+      <w:pPr>
+        <w:numPr>
+          <w:ilvl w:val="0"/>
+          <w:numId w:val="3"/>
+        </w:numPr>
+        <w:spacing w:after="240" w:before="0" w:beforeAutospacing="0" w:lineRule="auto"/>
+        <w:ind w:left="720" w:right="600" w:hanging="360"/>
+        <w:rPr>
+          <w:u w:val="none"/>
+        </w:rPr>
+      </w:pPr>
+      <w:r>
+        <w:rPr>
+          <w:rtl w:val="0"/>
+        </w:rPr>
+        <w:t xml:space="preserve">principales riesgos y oportunidades identificados en el análisis.</w:t>
+      </w:r>
+    </w:p>
+    <w:p>
+      <w:pPr>
+        <w:spacing w:after="240" w:before="240" w:lineRule="auto"/>
+        <w:ind w:right="600"/>
+        <w:rPr/>
+      </w:pPr>
+      <w:r>
+        <w:rPr>
+          <w:rtl w:val="0"/>
+        </w:rPr>
+        <w:t xml:space="preserve">El Directorio no requiere revisar cada registro individual, sino comprender los patrones generales que pueden influir en decisiones de inversión, adquisición y posicionamiento.</w:t>
+      </w:r>
+    </w:p>
+    <w:p>
+      <w:pPr>
+        <w:spacing w:after="240" w:before="240" w:lineRule="auto"/>
+        <w:ind w:right="600"/>
+        <w:rPr>
+          <w:b w:val="1"/>
+          <w:bCs w:val="1"/>
+        </w:rPr>
+      </w:pPr>
+      <w:r>
+        <w:rPr>
+          <w:b w:val="1"/>
+          <w:bCs w:val="1"/>
+          <w:rtl w:val="0"/>
+        </w:rPr>
+        <w:t xml:space="preserve">Gerencia de Contenidos y Adquisición</w:t>
+      </w:r>
+    </w:p>
+    <w:p>
+      <w:pPr>
+        <w:spacing w:after="240" w:before="240" w:lineRule="auto"/>
+        <w:ind w:right="600"/>
+        <w:rPr/>
+      </w:pPr>
+      <w:r>
+        <w:rPr>
+          <w:rtl w:val="0"/>
+        </w:rPr>
+        <w:t xml:space="preserve">La Gerencia de Contenidos y Adquisición necesita información más detallada para identificar géneros, países y contenidos con características relevantes en términos de popularidad, valoración y presencia dentro del catálogo. Esta información puede apoyar decisiones relacionadas con la adquisición, renovación y posicionamiento del contenido.</w:t>
+      </w:r>
+    </w:p>
+    <w:p>
+      <w:pPr>
+        <w:spacing w:after="240" w:before="240" w:lineRule="auto"/>
+        <w:ind w:right="600"/>
+        <w:rPr/>
+      </w:pPr>
+      <w:r>
+        <w:rPr>
+          <w:rtl w:val="0"/>
+        </w:rPr>
+        <w:t xml:space="preserve">La solución debe permitir analizar:</w:t>
+      </w:r>
+    </w:p>
+    <w:p>
+      <w:pPr>
+        <w:numPr>
+          <w:ilvl w:val="0"/>
+          <w:numId w:val="9"/>
+        </w:numPr>
+        <w:spacing w:after="0" w:afterAutospacing="0" w:before="240" w:lineRule="auto"/>
+        <w:ind w:left="720" w:right="600" w:hanging="360"/>
+        <w:rPr>
+          <w:u w:val="none"/>
+        </w:rPr>
+      </w:pPr>
+      <w:r>
+        <w:rPr>
+          <w:rtl w:val="0"/>
+        </w:rPr>
+        <w:t xml:space="preserve">géneros con mayor presencia;</w:t>
+      </w:r>
+    </w:p>
+    <w:p>
+      <w:pPr>
+        <w:numPr>
+          <w:ilvl w:val="0"/>
+          <w:numId w:val="9"/>
+        </w:numPr>
+        <w:spacing w:after="0" w:afterAutospacing="0" w:before="0" w:beforeAutospacing="0" w:lineRule="auto"/>
+        <w:ind w:left="720" w:right="600" w:hanging="360"/>
+        <w:rPr>
+          <w:u w:val="none"/>
+        </w:rPr>
+      </w:pPr>
+      <w:r>
+        <w:rPr>
+          <w:rtl w:val="0"/>
+        </w:rPr>
+        <w:t xml:space="preserve">países e idiomas representados;</w:t>
+      </w:r>
+    </w:p>
+    <w:p>
+      <w:pPr>
+        <w:numPr>
+          <w:ilvl w:val="0"/>
+          <w:numId w:val="9"/>
+        </w:numPr>
+        <w:spacing w:after="0" w:afterAutospacing="0" w:before="0" w:beforeAutospacing="0" w:lineRule="auto"/>
+        <w:ind w:left="720" w:right="600" w:hanging="360"/>
+        <w:rPr>
+          <w:u w:val="none"/>
+        </w:rPr>
+      </w:pPr>
+      <w:r>
+        <w:rPr>
+          <w:rtl w:val="0"/>
+        </w:rPr>
+        <w:t xml:space="preserve">diferencias entre películas y series;</w:t>
+      </w:r>
+    </w:p>
+    <w:p>
+      <w:pPr>
+        <w:numPr>
+          <w:ilvl w:val="0"/>
+          <w:numId w:val="9"/>
+        </w:numPr>
+        <w:spacing w:after="0" w:afterAutospacing="0" w:before="0" w:beforeAutospacing="0" w:lineRule="auto"/>
+        <w:ind w:left="720" w:right="600" w:hanging="360"/>
+        <w:rPr>
+          <w:u w:val="none"/>
+        </w:rPr>
+      </w:pPr>
+      <w:r>
+        <w:rPr>
+          <w:rtl w:val="0"/>
+        </w:rPr>
+        <w:t xml:space="preserve">segmentos con baja participación relativa;</w:t>
+      </w:r>
+    </w:p>
+    <w:p>
+      <w:pPr>
+        <w:numPr>
+          <w:ilvl w:val="0"/>
+          <w:numId w:val="9"/>
+        </w:numPr>
+        <w:spacing w:after="0" w:afterAutospacing="0" w:before="0" w:beforeAutospacing="0" w:lineRule="auto"/>
+        <w:ind w:left="720" w:right="600" w:hanging="360"/>
+        <w:rPr>
+          <w:u w:val="none"/>
+        </w:rPr>
+      </w:pPr>
+      <w:r>
+        <w:rPr>
+          <w:rtl w:val="0"/>
+        </w:rPr>
+        <w:t xml:space="preserve">popularidad y valoración promedio por categoría;</w:t>
+      </w:r>
+    </w:p>
+    <w:p>
+      <w:pPr>
+        <w:numPr>
+          <w:ilvl w:val="0"/>
+          <w:numId w:val="9"/>
+        </w:numPr>
+        <w:spacing w:after="240" w:before="0" w:beforeAutospacing="0" w:lineRule="auto"/>
+        <w:ind w:left="720" w:right="600" w:hanging="360"/>
+        <w:rPr>
+          <w:u w:val="none"/>
+        </w:rPr>
+      </w:pPr>
+      <w:r>
+        <w:rPr>
+          <w:rtl w:val="0"/>
+        </w:rPr>
+        <w:t xml:space="preserve">mercados que podrían evaluarse para futuras adquisiciones.</w:t>
+      </w:r>
+    </w:p>
+    <w:p>
+      <w:pPr>
+        <w:spacing w:after="240" w:before="240" w:lineRule="auto"/>
+        <w:ind w:right="600"/>
+        <w:rPr/>
+      </w:pPr>
+      <w:r>
+        <w:rPr>
+          <w:rtl w:val="0"/>
+        </w:rPr>
+        <w:t xml:space="preserve">Las oportunidades identificadas en esta etapa deben considerarse exploratorias. Antes de tomar una decisión de adquisición se requiere complementar el análisis con información sobre demanda real, derechos, costos, competencia y disponibilidad de contenido.</w:t>
+      </w:r>
+    </w:p>
+    <w:p>
+      <w:pPr>
+        <w:spacing w:after="240" w:before="240" w:lineRule="auto"/>
+        <w:ind w:right="600"/>
+        <w:rPr>
+          <w:b w:val="1"/>
+          <w:bCs w:val="1"/>
+        </w:rPr>
+      </w:pPr>
+      <w:r>
+        <w:rPr>
+          <w:b w:val="1"/>
+          <w:bCs w:val="1"/>
+          <w:rtl w:val="0"/>
+        </w:rPr>
+        <w:t xml:space="preserve">Gerencia de Marketing</w:t>
+      </w:r>
+    </w:p>
+    <w:p>
+      <w:pPr>
+        <w:spacing w:after="240" w:before="240" w:lineRule="auto"/>
+        <w:ind w:right="600"/>
+        <w:rPr/>
+      </w:pPr>
+      <w:r>
+        <w:rPr>
+          <w:rtl w:val="0"/>
+        </w:rPr>
+        <w:t xml:space="preserve">La Gerencia de Marketing requiere información orientada a detectar contenidos y categorías con potencial para campañas de promoción, posicionamiento y comunicación comercial. Para ello, necesita análisis de popularidad, valoración, tendencias del catálogo y atributos relevantes de los contenidos que permitan orientar decisiones comunicacionales y de mercadeo.</w:t>
+      </w:r>
+    </w:p>
+    <w:p>
+      <w:pPr>
+        <w:spacing w:after="240" w:before="240" w:lineRule="auto"/>
+        <w:ind w:right="600"/>
+        <w:rPr/>
+      </w:pPr>
+      <w:r>
+        <w:rPr>
+          <w:rtl w:val="0"/>
+        </w:rPr>
+        <w:t xml:space="preserve">Para esta audiencia son importantes:</w:t>
+      </w:r>
+    </w:p>
+    <w:p>
+      <w:pPr>
+        <w:numPr>
+          <w:ilvl w:val="0"/>
+          <w:numId w:val="7"/>
+        </w:numPr>
+        <w:spacing w:after="0" w:afterAutospacing="0" w:before="240" w:lineRule="auto"/>
+        <w:ind w:left="720" w:right="600" w:hanging="360"/>
+        <w:rPr>
+          <w:u w:val="none"/>
+        </w:rPr>
+      </w:pPr>
+      <w:r>
+        <w:rPr>
+          <w:rtl w:val="0"/>
+        </w:rPr>
+        <w:t xml:space="preserve">rankings de popularidad relativa;</w:t>
+      </w:r>
+    </w:p>
+    <w:p>
+      <w:pPr>
+        <w:numPr>
+          <w:ilvl w:val="0"/>
+          <w:numId w:val="7"/>
+        </w:numPr>
+        <w:spacing w:after="0" w:afterAutospacing="0" w:before="0" w:beforeAutospacing="0" w:lineRule="auto"/>
+        <w:ind w:left="720" w:right="600" w:hanging="360"/>
+        <w:rPr>
+          <w:u w:val="none"/>
+        </w:rPr>
+      </w:pPr>
+      <w:r>
+        <w:rPr>
+          <w:rtl w:val="0"/>
+        </w:rPr>
+        <w:t xml:space="preserve">valoración promedio;</w:t>
+      </w:r>
+    </w:p>
+    <w:p>
+      <w:pPr>
+        <w:numPr>
+          <w:ilvl w:val="0"/>
+          <w:numId w:val="7"/>
+        </w:numPr>
+        <w:spacing w:after="0" w:afterAutospacing="0" w:before="0" w:beforeAutospacing="0" w:lineRule="auto"/>
+        <w:ind w:left="720" w:right="600" w:hanging="360"/>
+        <w:rPr>
+          <w:u w:val="none"/>
+        </w:rPr>
+      </w:pPr>
+      <w:r>
+        <w:rPr>
+          <w:rtl w:val="0"/>
+        </w:rPr>
+        <w:t xml:space="preserve">cantidad de votos como referencia del respaldo de la evaluación;</w:t>
+      </w:r>
+    </w:p>
+    <w:p>
+      <w:pPr>
+        <w:numPr>
+          <w:ilvl w:val="0"/>
+          <w:numId w:val="7"/>
+        </w:numPr>
+        <w:spacing w:after="0" w:afterAutospacing="0" w:before="0" w:beforeAutospacing="0" w:lineRule="auto"/>
+        <w:ind w:left="720" w:right="600" w:hanging="360"/>
+        <w:rPr>
+          <w:u w:val="none"/>
+        </w:rPr>
+      </w:pPr>
+      <w:r>
+        <w:rPr>
+          <w:rtl w:val="0"/>
+        </w:rPr>
+        <w:t xml:space="preserve">género, país, idioma y tipo de contenido;</w:t>
+      </w:r>
+    </w:p>
+    <w:p>
+      <w:pPr>
+        <w:numPr>
+          <w:ilvl w:val="0"/>
+          <w:numId w:val="7"/>
+        </w:numPr>
+        <w:spacing w:after="0" w:afterAutospacing="0" w:before="0" w:beforeAutospacing="0" w:lineRule="auto"/>
+        <w:ind w:left="720" w:right="600" w:hanging="360"/>
+        <w:rPr>
+          <w:u w:val="none"/>
+        </w:rPr>
+      </w:pPr>
+      <w:r>
+        <w:rPr>
+          <w:rtl w:val="0"/>
+        </w:rPr>
+        <w:t xml:space="preserve">filtros por año y categoría;</w:t>
+      </w:r>
+    </w:p>
+    <w:p>
+      <w:pPr>
+        <w:numPr>
+          <w:ilvl w:val="0"/>
+          <w:numId w:val="7"/>
+        </w:numPr>
+        <w:spacing w:after="240" w:before="0" w:beforeAutospacing="0" w:lineRule="auto"/>
+        <w:ind w:left="720" w:right="600" w:hanging="360"/>
+        <w:rPr>
+          <w:u w:val="none"/>
+        </w:rPr>
+      </w:pPr>
+      <w:r>
+        <w:rPr>
+          <w:rtl w:val="0"/>
+        </w:rPr>
+        <w:t xml:space="preserve">identificación de contenidos con alta visibilidad y valoración favorable.</w:t>
+      </w:r>
+    </w:p>
+    <w:p>
+      <w:pPr>
+        <w:spacing w:after="240" w:before="240" w:lineRule="auto"/>
+        <w:ind w:right="600"/>
+        <w:rPr/>
+      </w:pPr>
+      <w:r>
+        <w:rPr>
+          <w:rtl w:val="0"/>
+        </w:rPr>
+        <w:t xml:space="preserve">La popularidad no debe utilizarse como único criterio de promoción, ya que un contenido puede tener alta visibilidad y una valoración moderada, o una valoración alta basada en pocos votos.</w:t>
+      </w:r>
+    </w:p>
+    <w:p>
+      <w:pPr>
         <w:pStyle w:val="Heading2"/>
         <w:rPr/>
       </w:pPr>
@@ -3364,18 +3959,132 @@
         <w:rPr>
           <w:rtl w:val="0"/>
         </w:rPr>
-        <w:t xml:space="preserve">La estrategia comunicacional se adapta a distintos niveles de decisión. Para el Directorio, se prioriza una visión ejecutiva y resumida del negocio; para la Gerencia de Contenidos y Adquisición, un análisis más detallado de géneros, países y contenidos; y para la Gerencia de Marketing, una perspectiva orientada a la promoción y posicionamiento de contenido. De esta forma, la solución no sólo comunica información, sino que facilita la toma de decisiones estratégicas y operativas en función de las necesidades de cada audiencia.</w:t>
-      </w:r>
-    </w:p>
-    <w:p>
-      <w:pPr>
-        <w:rPr/>
-      </w:pPr>
-      <w:r>
-        <w:rPr>
-          <w:rtl w:val="0"/>
-        </w:rPr>
-        <w:t xml:space="preserve">Para materializar este propósito, la solución se fundamenta en las fuentes de datos proporcionadas por StreamView Analytics, las cuales permiten caracterizar el catálogo desde distintas dimensiones y realizar comparaciones consistentes entre los contenidos.</w:t>
+        <w:t xml:space="preserve">La narrativa visual se organiza alrededor de seis preguntas:</w:t>
+      </w:r>
+    </w:p>
+    <w:p>
+      <w:pPr>
+        <w:numPr>
+          <w:ilvl w:val="0"/>
+          <w:numId w:val="4"/>
+        </w:numPr>
+        <w:spacing w:after="0" w:afterAutospacing="0"/>
+        <w:ind w:left="720" w:hanging="360"/>
+        <w:rPr>
+          <w:u w:val="none"/>
+        </w:rPr>
+      </w:pPr>
+      <w:r>
+        <w:rPr>
+          <w:rtl w:val="0"/>
+        </w:rPr>
+        <w:t xml:space="preserve">¿Qué tenemos?</w:t>
+      </w:r>
+    </w:p>
+    <w:p>
+      <w:pPr>
+        <w:numPr>
+          <w:ilvl w:val="0"/>
+          <w:numId w:val="4"/>
+        </w:numPr>
+        <w:spacing w:after="0" w:afterAutospacing="0" w:before="0" w:beforeAutospacing="0"/>
+        <w:ind w:left="720" w:hanging="360"/>
+        <w:rPr>
+          <w:u w:val="none"/>
+        </w:rPr>
+      </w:pPr>
+      <w:r>
+        <w:rPr>
+          <w:rtl w:val="0"/>
+        </w:rPr>
+        <w:t xml:space="preserve">¿Cómo se configuró el análisis?</w:t>
+      </w:r>
+    </w:p>
+    <w:p>
+      <w:pPr>
+        <w:numPr>
+          <w:ilvl w:val="0"/>
+          <w:numId w:val="4"/>
+        </w:numPr>
+        <w:spacing w:after="0" w:afterAutospacing="0" w:before="0" w:beforeAutospacing="0"/>
+        <w:ind w:left="720" w:hanging="360"/>
+        <w:rPr>
+          <w:u w:val="none"/>
+        </w:rPr>
+      </w:pPr>
+      <w:r>
+        <w:rPr>
+          <w:rtl w:val="0"/>
+        </w:rPr>
+        <w:t xml:space="preserve">¿Qué destaca?</w:t>
+      </w:r>
+    </w:p>
+    <w:p>
+      <w:pPr>
+        <w:numPr>
+          <w:ilvl w:val="0"/>
+          <w:numId w:val="4"/>
+        </w:numPr>
+        <w:spacing w:after="0" w:afterAutospacing="0" w:before="0" w:beforeAutospacing="0"/>
+        <w:ind w:left="720" w:hanging="360"/>
+        <w:rPr>
+          <w:u w:val="none"/>
+        </w:rPr>
+      </w:pPr>
+      <w:r>
+        <w:rPr>
+          <w:rtl w:val="0"/>
+        </w:rPr>
+        <w:t xml:space="preserve">¿La popularidad coincide con la calidad percibida?</w:t>
+      </w:r>
+    </w:p>
+    <w:p>
+      <w:pPr>
+        <w:numPr>
+          <w:ilvl w:val="0"/>
+          <w:numId w:val="4"/>
+        </w:numPr>
+        <w:spacing w:after="0" w:afterAutospacing="0" w:before="0" w:beforeAutospacing="0"/>
+        <w:ind w:left="720" w:hanging="360"/>
+        <w:rPr>
+          <w:u w:val="none"/>
+        </w:rPr>
+      </w:pPr>
+      <w:r>
+        <w:rPr>
+          <w:rtl w:val="0"/>
+        </w:rPr>
+        <w:t xml:space="preserve">¿Dónde existen oportunidades de análisis?</w:t>
+      </w:r>
+    </w:p>
+    <w:p>
+      <w:pPr>
+        <w:numPr>
+          <w:ilvl w:val="0"/>
+          <w:numId w:val="4"/>
+        </w:numPr>
+        <w:spacing w:before="0" w:beforeAutospacing="0"/>
+        <w:ind w:left="720" w:hanging="360"/>
+        <w:rPr>
+          <w:u w:val="none"/>
+        </w:rPr>
+      </w:pPr>
+      <w:r>
+        <w:rPr>
+          <w:rtl w:val="0"/>
+        </w:rPr>
+        <w:t xml:space="preserve">¿Qué decisiones pueden apoyarse?</w:t>
+      </w:r>
+    </w:p>
+    <w:p>
+      <w:pPr>
+        <w:rPr/>
+      </w:pPr>
+      <w:r>
+        <w:rPr>
+          <w:rtl w:val="0"/>
+        </w:rPr>
+        <w:t xml:space="preserve">De esta manera, la solución no se limita a mostrar gráficos descriptivos. Busca explicar qué representa cada indicador, cuáles son sus limitaciones y qué tipo de decisión puede apoyar cada hallazgo.</w:t>
       </w:r>
     </w:p>
     <w:p>
@@ -3431,9 +4140,17 @@
       </w:pPr>
       <w:r>
         <w:rPr>
-          <w:rtl w:val="0"/>
-        </w:rPr>
-        <w:t xml:space="preserve">Netflix Movies Detailed up to 2025: contiene información detallada de las películas disponibles en el catálogo, incluyendo características generales, clasificación, país, idioma, género, popularidad, valoración y variables financieras.</w:t>
+          <w:b w:val="1"/>
+          <w:bCs w:val="1"/>
+          <w:rtl w:val="0"/>
+        </w:rPr>
+        <w:t xml:space="preserve">Netflix Movies Detailed up to 2025:</w:t>
+      </w:r>
+      <w:r>
+        <w:rPr>
+          <w:rtl w:val="0"/>
+        </w:rPr>
+        <w:t xml:space="preserve"> contiene información detallada de las películas disponibles en el catálogo, incluyendo características generales, clasificación, país, idioma, género, popularidad, valoración y variables financieras.</w:t>
       </w:r>
     </w:p>
     <w:p>
@@ -3450,9 +4167,17 @@
       </w:pPr>
       <w:r>
         <w:rPr>
-          <w:rtl w:val="0"/>
-        </w:rPr>
-        <w:t xml:space="preserve">Netflix TV Shows Detailed up to 2025: contiene información correspondiente a las series disponibles en el catálogo, incluyendo características generales, género, idioma, país, popularidad, valoración y año de estreno.</w:t>
+          <w:b w:val="1"/>
+          <w:bCs w:val="1"/>
+          <w:rtl w:val="0"/>
+        </w:rPr>
+        <w:t xml:space="preserve">Netflix TV Shows Detailed up to 2025</w:t>
+      </w:r>
+      <w:r>
+        <w:rPr>
+          <w:rtl w:val="0"/>
+        </w:rPr>
+        <w:t xml:space="preserve">: contiene información correspondiente a las series disponibles en el catálogo, incluyendo características generales, género, idioma, país, popularidad, valoración y año de estreno.</w:t>
       </w:r>
     </w:p>
     <w:p>
@@ -3836,7 +4561,7 @@
               <w:rPr>
                 <w:rtl w:val="0"/>
               </w:rPr>
-              <w:t xml:space="preserve">15</w:t>
+              <w:t xml:space="preserve">16</w:t>
             </w:r>
           </w:p>
         </w:tc>
@@ -3894,17 +4619,8 @@
     </w:p>
     <w:p>
       <w:pPr>
-        <w:rPr/>
-      </w:pPr>
-      <w:r>
-        <w:rPr>
-          <w:rtl w:val="0"/>
-        </w:rPr>
-      </w:r>
-    </w:p>
-    <w:p>
-      <w:pPr>
         <w:pStyle w:val="Heading2"/>
+        <w:ind w:firstLine="720"/>
         <w:rPr/>
       </w:pPr>
       <w:bookmarkStart w:colFirst="0" w:colLast="0" w:name="_60varo6sx02b" w:id="14"/>
@@ -5259,7 +5975,7 @@
         <w:rPr>
           <w:rtl w:val="0"/>
         </w:rPr>
-        <w:t xml:space="preserve">Previo al análisis exploratorio, se realizará un proceso de revisión y preparación de los conjuntos de datos con el objetivo de asegurar la consistencia de la información utilizada en las visualizaciones. Esta etapa considerará la identificación de valores nulos, registros duplicados, tipos de datos, formatos inconsistentes, variables categóricas, fechas, valores atípicos y la disponibilidad parcial de determinadas variables.</w:t>
+        <w:t xml:space="preserve">Previo al análisis exploratorio, se realizó un proceso de revisión y preparación de los conjuntos de datos con el objetivo de asegurar la consistencia de la información analítica utilizada en las visualizaciones. Esta etapa consideró la identificación de valores nulos, registros duplicados, tipos de datos, formatos inconsistentes, valores atípicos y la disponibilidad parcial de determinadas variables.</w:t>
       </w:r>
     </w:p>
     <w:p>
@@ -5272,7 +5988,7 @@
         <w:rPr>
           <w:rtl w:val="0"/>
         </w:rPr>
-        <w:t xml:space="preserve">Asimismo, se verificará la compatibilidad entre las variables comunes de ambos conjuntos de datos antes de realizar su integración. Los archivos originales se mantendrán sin modificaciones, y las transformaciones necesarias se llevarán a cabo sobre copias destinadas al procesamiento y análisis. Esta práctica permite preservar la fuente primaria y asegurar que cualquier ajuste realizado responda exclusivamente a criterios de calidad y preparación de datos.</w:t>
+        <w:t xml:space="preserve">Asimismo, se verificó la compatibilidad entre las variables comunes de ambos conjuntos antes de realizar la integración. Los archivos originales se mantuvieron sin modificaciones, y las transformaciones necesarias se llevaron a cabo sobre copias destinadas al procesamiento y análisis. Esta práctica permitió preservar la fuente primaria y asegurar que cualquier ajuste realizado respondiera exclusivamente a criterios de calidad y preparación de datos.</w:t>
       </w:r>
     </w:p>
     <w:p>
@@ -5285,7 +6001,7 @@
         <w:rPr>
           <w:rtl w:val="0"/>
         </w:rPr>
-        <w:t xml:space="preserve">Una vez completada esta etapa de revisión, preparación e integración, se dispondrá de una base analítica consistente para desarrollar el análisis exploratorio. Esta etapa permitirá examinar visualmente la composición del catálogo, detectar patrones y tendencias, e identificar aquellos hallazgos que posteriormente estructuran la narrativa visual y la solución interactiva.</w:t>
+        <w:t xml:space="preserve">Una vez completada la etapa de revisión, preparación e integración, se dispone de una base analítica consistente para desarrollar el análisis exploratorio. Esta etapa permite examinar visualmente la composición del catálogo, detectar patrones y tendencias, e identificar hallazgos que posteriormente estructuran la narrativa visual y la solución interactiva.</w:t>
       </w:r>
     </w:p>
     <w:p>
@@ -5298,18 +6014,344 @@
         <w:rPr>
           <w:rtl w:val="0"/>
         </w:rPr>
+        <w:t xml:space="preserve">La preparación de los datos consideró las siguientes etapas:</w:t>
+      </w:r>
+    </w:p>
+    <w:p>
+      <w:pPr>
+        <w:numPr>
+          <w:ilvl w:val="0"/>
+          <w:numId w:val="8"/>
+        </w:numPr>
+        <w:spacing w:after="0" w:afterAutospacing="0" w:before="240" w:lineRule="auto"/>
+        <w:ind w:left="720" w:right="600" w:hanging="360"/>
+        <w:rPr>
+          <w:u w:val="none"/>
+        </w:rPr>
+      </w:pPr>
+      <w:r>
+        <w:rPr>
+          <w:rtl w:val="0"/>
+        </w:rPr>
+        <w:t xml:space="preserve">Lectura de las fuentes originales sin modificar los archivos de origen.</w:t>
+      </w:r>
+    </w:p>
+    <w:p>
+      <w:pPr>
+        <w:numPr>
+          <w:ilvl w:val="0"/>
+          <w:numId w:val="8"/>
+        </w:numPr>
+        <w:spacing w:after="0" w:afterAutospacing="0" w:before="0" w:beforeAutospacing="0" w:lineRule="auto"/>
+        <w:ind w:left="720" w:right="600" w:hanging="360"/>
+        <w:rPr>
+          <w:u w:val="none"/>
+        </w:rPr>
+      </w:pPr>
+      <w:r>
+        <w:rPr>
+          <w:rtl w:val="0"/>
+        </w:rPr>
+        <w:t xml:space="preserve">Revisión de nombres de columnas, con revisión de compatibilidad entre películas y series.</w:t>
+      </w:r>
+    </w:p>
+    <w:p>
+      <w:pPr>
+        <w:numPr>
+          <w:ilvl w:val="0"/>
+          <w:numId w:val="8"/>
+        </w:numPr>
+        <w:spacing w:after="0" w:afterAutospacing="0" w:before="0" w:beforeAutospacing="0" w:lineRule="auto"/>
+        <w:ind w:left="720" w:right="600" w:hanging="360"/>
+        <w:rPr>
+          <w:u w:val="none"/>
+        </w:rPr>
+      </w:pPr>
+      <w:r>
+        <w:rPr>
+          <w:rtl w:val="0"/>
+        </w:rPr>
+        <w:t xml:space="preserve">Normalización de espacios, textos vacíos y tipos de datos.</w:t>
+      </w:r>
+    </w:p>
+    <w:p>
+      <w:pPr>
+        <w:numPr>
+          <w:ilvl w:val="0"/>
+          <w:numId w:val="8"/>
+        </w:numPr>
+        <w:spacing w:after="0" w:afterAutospacing="0" w:before="0" w:beforeAutospacing="0" w:lineRule="auto"/>
+        <w:ind w:left="720" w:right="600" w:hanging="360"/>
+        <w:rPr>
+          <w:u w:val="none"/>
+        </w:rPr>
+      </w:pPr>
+      <w:r>
+        <w:rPr>
+          <w:rtl w:val="0"/>
+        </w:rPr>
+        <w:t xml:space="preserve">Conversión de fechas y variables numéricas para permitir comparaciones consistentes.</w:t>
+      </w:r>
+    </w:p>
+    <w:p>
+      <w:pPr>
+        <w:numPr>
+          <w:ilvl w:val="0"/>
+          <w:numId w:val="8"/>
+        </w:numPr>
+        <w:spacing w:after="0" w:afterAutospacing="0" w:before="0" w:beforeAutospacing="0" w:lineRule="auto"/>
+        <w:ind w:left="720" w:right="600" w:hanging="360"/>
+        <w:rPr>
+          <w:u w:val="none"/>
+        </w:rPr>
+      </w:pPr>
+      <w:r>
+        <w:rPr>
+          <w:rtl w:val="0"/>
+        </w:rPr>
+        <w:t xml:space="preserve">Incorporación de budget y revenue al esquema común, manteniendo valores nulos para series.</w:t>
+      </w:r>
+    </w:p>
+    <w:p>
+      <w:pPr>
+        <w:numPr>
+          <w:ilvl w:val="0"/>
+          <w:numId w:val="8"/>
+        </w:numPr>
+        <w:spacing w:after="0" w:afterAutospacing="0" w:before="0" w:beforeAutospacing="0" w:lineRule="auto"/>
+        <w:ind w:left="720" w:right="600" w:hanging="360"/>
+        <w:rPr>
+          <w:u w:val="none"/>
+        </w:rPr>
+      </w:pPr>
+      <w:r>
+        <w:rPr>
+          <w:rtl w:val="0"/>
+        </w:rPr>
+        <w:t xml:space="preserve">Unión vertical de películas y series mediante concatenación, sin utilizar JOIN o MERGE.</w:t>
+      </w:r>
+    </w:p>
+    <w:p>
+      <w:pPr>
+        <w:numPr>
+          <w:ilvl w:val="0"/>
+          <w:numId w:val="8"/>
+        </w:numPr>
+        <w:spacing w:after="0" w:afterAutospacing="0" w:before="0" w:beforeAutospacing="0" w:lineRule="auto"/>
+        <w:ind w:left="720" w:right="600" w:hanging="360"/>
+        <w:rPr>
+          <w:u w:val="none"/>
+        </w:rPr>
+      </w:pPr>
+      <w:r>
+        <w:rPr>
+          <w:rtl w:val="0"/>
+        </w:rPr>
+        <w:t xml:space="preserve">Eliminación de variables no analíticas o poco útiles para el análisis final, como description, show_id y duration.</w:t>
+      </w:r>
+    </w:p>
+    <w:p>
+      <w:pPr>
+        <w:numPr>
+          <w:ilvl w:val="0"/>
+          <w:numId w:val="8"/>
+        </w:numPr>
+        <w:spacing w:after="0" w:afterAutospacing="0" w:before="0" w:beforeAutospacing="0" w:lineRule="auto"/>
+        <w:ind w:left="720" w:right="600" w:hanging="360"/>
+        <w:rPr>
+          <w:u w:val="none"/>
+        </w:rPr>
+      </w:pPr>
+      <w:r>
+        <w:rPr>
+          <w:rtl w:val="0"/>
+        </w:rPr>
+        <w:t xml:space="preserve">Conservación de una fila por registro del catálogo maestro.</w:t>
+      </w:r>
+    </w:p>
+    <w:p>
+      <w:pPr>
+        <w:numPr>
+          <w:ilvl w:val="0"/>
+          <w:numId w:val="8"/>
+        </w:numPr>
+        <w:spacing w:after="240" w:before="0" w:beforeAutospacing="0" w:lineRule="auto"/>
+        <w:ind w:left="720" w:right="600" w:hanging="360"/>
+        <w:rPr>
+          <w:u w:val="none"/>
+        </w:rPr>
+      </w:pPr>
+      <w:r>
+        <w:rPr>
+          <w:rtl w:val="0"/>
+        </w:rPr>
+        <w:t xml:space="preserve">Revisión de valores faltantes, duplicados completos y rangos inválidos.</w:t>
       </w:r>
     </w:p>
     <w:p>
       <w:pPr>
         <w:spacing w:after="240" w:before="240" w:lineRule="auto"/>
-        <w:ind w:left="0" w:right="600" w:firstLine="0"/>
-        <w:rPr/>
-      </w:pPr>
-      <w:r>
-        <w:rPr>
-          <w:rtl w:val="0"/>
-        </w:rPr>
+        <w:ind w:right="600"/>
+        <w:rPr/>
+      </w:pPr>
+      <w:r>
+        <w:rPr>
+          <w:rtl w:val="0"/>
+        </w:rPr>
+        <w:t xml:space="preserve">Los principales resultados de la validación son:</w:t>
+      </w:r>
+    </w:p>
+    <w:p>
+      <w:pPr>
+        <w:numPr>
+          <w:ilvl w:val="0"/>
+          <w:numId w:val="5"/>
+        </w:numPr>
+        <w:spacing w:after="0" w:afterAutospacing="0" w:before="240" w:lineRule="auto"/>
+        <w:ind w:left="720" w:right="600" w:hanging="360"/>
+        <w:rPr>
+          <w:u w:val="none"/>
+        </w:rPr>
+      </w:pPr>
+      <w:r>
+        <w:rPr>
+          <w:rtl w:val="0"/>
+        </w:rPr>
+        <w:t xml:space="preserve">32.000 registros en el dataset integrado;</w:t>
+      </w:r>
+    </w:p>
+    <w:p>
+      <w:pPr>
+        <w:numPr>
+          <w:ilvl w:val="0"/>
+          <w:numId w:val="5"/>
+        </w:numPr>
+        <w:spacing w:after="0" w:afterAutospacing="0" w:before="0" w:beforeAutospacing="0" w:lineRule="auto"/>
+        <w:ind w:left="720" w:right="600" w:hanging="360"/>
+        <w:rPr>
+          <w:u w:val="none"/>
+        </w:rPr>
+      </w:pPr>
+      <w:r>
+        <w:rPr>
+          <w:rtl w:val="0"/>
+        </w:rPr>
+        <w:t xml:space="preserve">16.000 películas y 16.000 series;</w:t>
+      </w:r>
+    </w:p>
+    <w:p>
+      <w:pPr>
+        <w:numPr>
+          <w:ilvl w:val="0"/>
+          <w:numId w:val="5"/>
+        </w:numPr>
+        <w:spacing w:after="0" w:afterAutospacing="0" w:before="0" w:beforeAutospacing="0" w:lineRule="auto"/>
+        <w:ind w:left="720" w:right="600" w:hanging="360"/>
+        <w:rPr>
+          <w:u w:val="none"/>
+        </w:rPr>
+      </w:pPr>
+      <w:r>
+        <w:rPr>
+          <w:rtl w:val="0"/>
+        </w:rPr>
+        <w:t xml:space="preserve">0 duplicados completos;</w:t>
+      </w:r>
+    </w:p>
+    <w:p>
+      <w:pPr>
+        <w:numPr>
+          <w:ilvl w:val="0"/>
+          <w:numId w:val="5"/>
+        </w:numPr>
+        <w:spacing w:after="0" w:afterAutospacing="0" w:before="0" w:beforeAutospacing="0" w:lineRule="auto"/>
+        <w:ind w:left="720" w:right="600" w:hanging="360"/>
+        <w:rPr>
+          <w:u w:val="none"/>
+        </w:rPr>
+      </w:pPr>
+      <w:r>
+        <w:rPr>
+          <w:rtl w:val="0"/>
+        </w:rPr>
+        <w:t xml:space="preserve">0 valores fuera de los rangos revisados;</w:t>
+      </w:r>
+    </w:p>
+    <w:p>
+      <w:pPr>
+        <w:numPr>
+          <w:ilvl w:val="0"/>
+          <w:numId w:val="5"/>
+        </w:numPr>
+        <w:spacing w:after="0" w:afterAutospacing="0" w:before="0" w:beforeAutospacing="0" w:lineRule="auto"/>
+        <w:ind w:left="720" w:right="600" w:hanging="360"/>
+        <w:rPr>
+          <w:u w:val="none"/>
+        </w:rPr>
+      </w:pPr>
+      <w:r>
+        <w:rPr>
+          <w:rtl w:val="0"/>
+        </w:rPr>
+        <w:t xml:space="preserve">3.540 películas con budget y revenue disponibles;</w:t>
+      </w:r>
+    </w:p>
+    <w:p>
+      <w:pPr>
+        <w:numPr>
+          <w:ilvl w:val="0"/>
+          <w:numId w:val="5"/>
+        </w:numPr>
+        <w:spacing w:after="240" w:before="0" w:beforeAutospacing="0" w:lineRule="auto"/>
+        <w:ind w:left="720" w:right="600" w:hanging="360"/>
+        <w:rPr>
+          <w:u w:val="none"/>
+        </w:rPr>
+      </w:pPr>
+      <w:r>
+        <w:rPr>
+          <w:rtl w:val="0"/>
+        </w:rPr>
+        <w:t xml:space="preserve">aproximadamente 22,1 % de cobertura financiera completa sobre las películas.</w:t>
+      </w:r>
+    </w:p>
+    <w:p>
+      <w:pPr>
+        <w:spacing w:after="240" w:before="240" w:lineRule="auto"/>
+        <w:ind w:right="600"/>
+        <w:rPr/>
+      </w:pPr>
+      <w:r>
+        <w:rPr>
+          <w:rtl w:val="0"/>
+        </w:rPr>
+        <w:t xml:space="preserve">En la versión final del catálogo, las variables show_id y duration no se conservan porque no aportan valor analítico confiable ni una dimensión útil para el análisis. show_id presentaba duplicados y no funcionaba como clave de negocio fiable; duration estaba casi completamente nula y no ofrecía una comparación útil entre formatos.</w:t>
+      </w:r>
+    </w:p>
+    <w:p>
+      <w:pPr>
+        <w:spacing w:after="240" w:before="240" w:lineRule="auto"/>
+        <w:ind w:right="600"/>
+        <w:rPr/>
+      </w:pPr>
+      <w:r>
+        <w:rPr>
+          <w:rtl w:val="0"/>
+        </w:rPr>
+        <w:t xml:space="preserve">Para analizar géneros, países e idiomas se crean tablas derivadas en memoria mediante la separación controlada de valores múltiples. Esta transformación no modifica ni multiplica las filas del dataset maestro.</w:t>
+      </w:r>
+    </w:p>
+    <w:p>
+      <w:pPr>
+        <w:spacing w:after="240" w:before="240" w:lineRule="auto"/>
+        <w:ind w:right="600"/>
+        <w:rPr/>
+      </w:pPr>
+      <w:r>
+        <w:rPr>
+          <w:rtl w:val="0"/>
+        </w:rPr>
+        <w:t xml:space="preserve">El análisis financiero se limita a películas con presupuesto e ingresos disponibles y con presupuesto mayor que cero. Por lo tanto, sus resultados deben interpretarse como una referencia exploratoria del conjunto de datos, no como una medición de rentabilidad directa de StreamView.</w:t>
       </w:r>
     </w:p>
     <w:p>
@@ -5342,7 +6384,7 @@
         <w:rPr>
           <w:rtl w:val="0"/>
         </w:rPr>
-        <w:t xml:space="preserve">El análisis exploratorio del catálogo audiovisual de StreamView Analytics se orienta a responder preguntas clave sobre su composición, evolución y relevancia dentro del negocio. A partir de la información disponible, se busca comprender qué contiene el catálogo, cómo se ha configurado a lo largo del tiempo, qué segmentos destacan y qué indicadores permiten identificar oportunidades para la toma de decisiones. La estructura del análisis sigue una secuencia lógica: primero se describe el catálogo, luego se observa su evolución, después se identifican los contenidos y variables más relevantes y, finalmente, se concluye qué decisiones pueden apoyarse con esta información.</w:t>
+        <w:t xml:space="preserve">El análisis exploratorio del catálogo audiovisual de StreamView Analytics se orientó a responder preguntas clave sobre su composición, evolución y relevancia dentro del negocio. A partir del catálogo limpio y validado, se buscó comprender qué contiene la oferta, cómo se ha configurado a lo largo del tiempo, qué segmentos destacan y qué indicadores permiten identificar oportunidades para la toma de decisiones. La estructura del análisis sigue una secuencia lógica: primero se describe el catálogo, luego se observa su evolución, después se identifican los contenidos y variables más relevantes, y finalmente se concluye qué decisiones pueden apoyarse con esta información. Cada hallazgo fue validado mediante visualizaciones específicas, cuya interpretación se presenta a continuación.</w:t>
       </w:r>
       <w:r>
         <w:rPr>
@@ -5373,7 +6415,18 @@
         <w:rPr>
           <w:rtl w:val="0"/>
         </w:rPr>
-        <w:t xml:space="preserve">La primera pregunta del análisis consiste en comprender la estructura general del catálogo y su distribución por tipo de contenido. Para ello, se analizará la proporción entre películas y series, así como la participación de géneros, países e idiomas más representativos. Esta primera mirada permite identificar la composición del inventario y detectar posibles desequilibrios o concentraciones que puedan influir en la estrategia de contenido.</w:t>
+        <w:t xml:space="preserve">Antes de analizar tendencias o patrones, resulta fundamental verificar qué tan completos y confiables son los campos disponibles, porque esto define si un hallazgo es útil para apoyar decisiones comerciales. El catálogo integrado de StreamView Analytics está compuesto por 32.000 contenidos, distribuidos equitativamente entre 16.000 películas (50%) y 16.000 series (50%), incorporados entre los años 2010 y 2025.</w:t>
+      </w:r>
+    </w:p>
+    <w:p>
+      <w:pPr>
+        <w:rPr/>
+      </w:pPr>
+      <w:r>
+        <w:rPr>
+          <w:rtl w:val="0"/>
+        </w:rPr>
+        <w:t xml:space="preserve">El proceso de integración vertical de ambas fuentes fue posible gracias a que comparten 16 variables. Las únicas variables exclusivas de películas son budget y revenue, lo que limita el análisis financiero exclusivamente al segmento cinematográfico. La estructura final del dataset se consolidó después de un proceso de limpieza, normalización y validación, en el que se eliminaron variables no analíticas o poco útiles para la etapa final del análisis.</w:t>
       </w:r>
     </w:p>
     <w:p>
@@ -5399,7 +6452,18 @@
         <w:rPr>
           <w:rtl w:val="0"/>
         </w:rPr>
-        <w:t xml:space="preserve">Una vez conocida la composición general del catálogo, se analiza cómo ha evolucionado a lo largo del tiempo. Esta etapa permite observar la distribución por año de lanzamiento, la evolución de películas y series, y la consolidación de determinados géneros o mercados. La visualización temporal ayuda a identificar patrones de crecimiento, estabilidad o declive, así como cambios relevantes en la estrategia de producción y adquisición.</w:t>
+        <w:t xml:space="preserve">Una vez conocida la composición general del catálogo, se analiza cómo ha evolucionado a lo largo del tiempo. Esta etapa permite observar la distribución por año de incorporación al catálogo, la evolución de películas y series, y la consolidación de determinados géneros o mercados. La visualización temporal ayuda a identificar patrones de crecimiento, estabilidad o declive, así como cambios relevantes en la estrategia de producción y adquisición.</w:t>
+      </w:r>
+    </w:p>
+    <w:p>
+      <w:pPr>
+        <w:rPr/>
+      </w:pPr>
+      <w:r>
+        <w:rPr>
+          <w:rtl w:val="0"/>
+        </w:rPr>
+        <w:t xml:space="preserve">El análisis sugiere que la oferta de contenido ha crecido de manera sostenida en el periodo analizado, con una estructura balanceada entre películas y series. Esta evolución es relevante para la toma de decisiones de contenido y para evaluar si la proporción actual de cada formato responde a la demanda real o si existe margen para ajustar la estrategia comercial.</w:t>
       </w:r>
     </w:p>
     <w:p>
@@ -5430,6 +6494,17 @@
     </w:p>
     <w:p>
       <w:pPr>
+        <w:rPr/>
+      </w:pPr>
+      <w:r>
+        <w:rPr>
+          <w:rtl w:val="0"/>
+        </w:rPr>
+        <w:t xml:space="preserve">El análisis de géneros muestra una concentración clara en categorías tradicionales, mientras que la distribución por país e idioma permite reconocer mercados más representativos y áreas con mayor potencial de expansión. Por su parte, la comparación entre popularidad y valoración permite distinguir entre contenido con alta visibilidad y contenido con alta calidad percibida, una diferencia clave para la estrategia de contenido y marketing.</w:t>
+      </w:r>
+    </w:p>
+    <w:p>
+      <w:pPr>
         <w:pStyle w:val="Heading2"/>
         <w:rPr/>
       </w:pPr>
@@ -5455,6 +6530,17 @@
     </w:p>
     <w:p>
       <w:pPr>
+        <w:rPr/>
+      </w:pPr>
+      <w:r>
+        <w:rPr>
+          <w:rtl w:val="0"/>
+        </w:rPr>
+        <w:t xml:space="preserve">La comparación sugiere que ambas señales presentan una relación positiva, pero no necesariamente proporcional ni automática. Esto implica que un título puede ser muy popular sin necesariamente obtener la mejor valoración, y viceversa. Este hallazgo resulta especialmente relevante para la estrategia de marketing, porque ayuda a distinguir entre contenido con fuerte demanda y contenido con fuerte potencial de recomendación o reputación.</w:t>
+      </w:r>
+    </w:p>
+    <w:p>
+      <w:pPr>
         <w:pStyle w:val="Heading2"/>
         <w:rPr/>
       </w:pPr>
@@ -5480,6 +6566,17 @@
     </w:p>
     <w:p>
       <w:pPr>
+        <w:rPr/>
+      </w:pPr>
+      <w:r>
+        <w:rPr>
+          <w:rtl w:val="0"/>
+        </w:rPr>
+        <w:t xml:space="preserve">A partir del análisis exploratorio, se observan oportunidades en segmentos con baja presencia relativa pero alta popularidad, así como en contenidos con buena valoración que no han alcanzado suficiente visibilidad. Este tipo de hallazgos es útil para definir decisiones de adquisición, promoción y posicionamiento, tanto para contenidos ya presentes como para nuevas incorporaciones.</w:t>
+      </w:r>
+    </w:p>
+    <w:p>
+      <w:pPr>
         <w:pStyle w:val="Heading2"/>
         <w:rPr/>
       </w:pPr>
@@ -5502,6 +6599,17 @@
         </w:rPr>
         <w:t xml:space="preserve">La última etapa del análisis busca cerrar la narrativa con una interpretación orientada a la acción. A partir de los hallazgos anteriores, se elaboran conclusiones sobre la composición, evolución y relevancia del catálogo, así como recomendaciones para la toma de decisiones relacionadas con contenido, promoción, adquisición y posicionamiento. De esta manera, las visualizaciones dejan de ser una representación descriptiva y pasan a convertirse en una herramienta para apoyar decisiones estratégicas y operativas.</w:t>
       </w:r>
+    </w:p>
+    <w:p>
+      <w:pPr>
+        <w:rPr/>
+      </w:pPr>
+      <w:r>
+        <w:rPr>
+          <w:rtl w:val="0"/>
+        </w:rPr>
+        <w:t xml:space="preserve">Los principales hallazgos sugieren que el catálogo se encuentra equilibrado entre películas y series, con una oferta diversa en géneros, países e idiomas. Sin embargo, la estrategia debe seguir evaluando si esta composición responde adecuadamente a la demanda real, a la competitividad del mercado y a los objetivos de crecimiento de la organización. En ese sentido, el análisis no solo describe el catálogo, sino que también aporta una base para priorizar adquisiciones, orientar campañas de marketing y ajustar la cartera de contenido con mayor evidencia.</w:t>
+      </w:r>
       <w:r>
         <w:rPr>
           <w:rtl w:val="0"/>
@@ -5531,18 +6639,18 @@
         <w:rPr>
           <w:rtl w:val="0"/>
         </w:rPr>
-        <w:t xml:space="preserve">La selección de las representaciones gráficas del proyecto responde a la necesidad de comunicar de manera efectiva el contenido del catálogo audiovisual de StreamView Analytics y a la intención de resolver problemas de catalogación, composición y relevancia del contenido. Dado que el conjunto de datos incluye variables categóricas, numéricas y temporales, es necesario utilizar visualizaciones que permitan identificar patrones, comparar segmentos y resumir grandes volúmenes de información sin perder claridad interpretativa. En este sentido, las representaciones gráficas no solo cumplen una función estética, sino que permiten transformar datos complejos en conocimiento útil para la toma de decisiones sobre el catálogo.</w:t>
-      </w:r>
-    </w:p>
-    <w:p>
-      <w:pPr>
-        <w:rPr/>
-      </w:pPr>
-      <w:r>
-        <w:rPr>
-          <w:rtl w:val="0"/>
-        </w:rPr>
-        <w:t xml:space="preserve">En el marco del análisis exploratorio, se priorizan gráficos que permitan responder preguntas clave del proyecto: ¿qué tenemos?, ¿cómo se ha configurado el catálogo?, ¿qué destaca?, ¿la popularidad refleja calidad percibida?, ¿dónde hay oportunidades? y ¿qué decisiones pueden apoyarse con estos hallazgos? Para responder a estas preguntas, se emplearán gráficos de barras para comparar géneros, países e idiomas más representativos; gráficos de líneas o series temporales para observar la evolución del catálogo a lo largo del tiempo; y diagramas de dispersión para analizar la relación entre popularidad y valoración. Estas representaciones son adecuadas para identificar concentraciones, tendencias y diferencias relevantes dentro del inventario de contenidos.</w:t>
+        <w:t xml:space="preserve">La selección de las representaciones gráficas del proyecto responde a la necesidad de comunicar de manera efectiva el contenido del catálogo audiovisual de StreamView Analytics y a la intención de resumir, comparar y analizar los patrones relevantes del inventario de contenidos. El conjunto final de datos está compuesto por 32.000 registros, distribuidos entre 16.000 películas y 16.000 series, y contiene variables categóricas, numéricas y temporales que requieren tratamientos visuales distintos para facilitar su interpretación. Por ello, las representaciones gráficas no solo cumplen una función estética, sino que permiten transformar información compleja en conocimiento útil para la toma de decisiones sobre catálogo, inversión, adquisición y promoción.</w:t>
+      </w:r>
+    </w:p>
+    <w:p>
+      <w:pPr>
+        <w:rPr/>
+      </w:pPr>
+      <w:r>
+        <w:rPr>
+          <w:rtl w:val="0"/>
+        </w:rPr>
+        <w:t xml:space="preserve">En el marco del análisis exploratorio, se priorizan gráficos que permiten responder preguntas clave del proyecto: ¿qué contiene el catálogo?, ¿cómo se ha configurado a lo largo del tiempo?, ¿qué segmentos destacan?, ¿la popularidad refleja calidad percibida?, ¿dónde hay oportunidades? y ¿qué decisiones pueden apoyarse con estos hallazgos? Para responder a estas preguntas, se emplean gráficos de barras para comparar géneros, países e idiomas más representativos; gráficos de líneas o series temporales para observar la evolución del catálogo; y diagramas de dispersión para analizar la relación entre popularidad y valoración. Estas representaciones son adecuadas porque permiten identificar concentraciones, tendencias y diferencias relevantes en un volumen de información grande sin perder claridad interpretativa.</w:t>
       </w:r>
     </w:p>
     <w:p>
@@ -5564,7 +6672,18 @@
         <w:rPr>
           <w:rtl w:val="0"/>
         </w:rPr>
-        <w:t xml:space="preserve">En resumen, la justificación de las representaciones gráficas radica en su capacidad para transformar datos complejos en una narrativa visual clara, útil y accionable. Esto permite que el análisis no se limite a describir la información, sino que contribuya a resolver los problemas de catálogo mediante una interpretación más profunda de la composición, evolución y relevancia del contenido.</w:t>
+        <w:t xml:space="preserve">La justificación técnica también se apoya en la naturaleza de las variables del dataset limpio. Las variables categóricas, como género, país e idioma, se comparan mejor con gráficos de barras o rankings; las series temporales permiten evaluar la evolución del portafolio por año de incorporación; y la relación entre popularidad y valoración requiere una vista de dispersión para observar patrones de comportamiento, no solo tendencias aisladas. En conjunto, estas decisiones visuales permiten que el análisis no se limite a describir la información, sino que contribuya a resolver los problemas de catálogo mediante una interpretación más profunda de la composición, evolución y relevancia del contenido.</w:t>
+      </w:r>
+    </w:p>
+    <w:p>
+      <w:pPr>
+        <w:rPr/>
+      </w:pPr>
+      <w:r>
+        <w:rPr>
+          <w:rtl w:val="0"/>
+        </w:rPr>
+        <w:t xml:space="preserve">En resumen, la justificación de las representaciones gráficas radica en su capacidad para transformar datos complejos en una narrativa visual clara, útil y accesible. Esto permite que el análisis no solo describa el catálogo, sino que también apoye decisiones estratégicas sobre contenido, adquisición, marketing e inversión, con una base más sólida en la evidencia del conjunto de datos.</w:t>
       </w:r>
     </w:p>
     <w:p>
@@ -5601,18 +6720,29 @@
         <w:rPr>
           <w:rtl w:val="0"/>
         </w:rPr>
-        <w:t xml:space="preserve">Esta estructura narrativa responde a la necesidad de comunicar con claridad a distintas audiencias. Para el Directorio, la historia debe centrarse en una visión general del catálogo, sus tendencias principales y las oportunidades estratégicas que este presenta; para la Gerencia de Contenidos y Adquisición, debe profundizar en la composición del catálogo, los géneros predominantes y la procedencia de las producciones; y para la Gerencia de Marketing, debe enfatizar los contenidos con mayor potencial de posicionamiento y promoción. De esta forma, la narrativa visual adapta el mismo conjunto de datos a distintos niveles de análisis sin perder consistencia ni propósito.</w:t>
-      </w:r>
-    </w:p>
-    <w:p>
-      <w:pPr>
-        <w:rPr/>
-      </w:pPr>
-      <w:r>
-        <w:rPr>
-          <w:rtl w:val="0"/>
-        </w:rPr>
-        <w:t xml:space="preserve">La historia visual se construye a partir de una secuencia de preguntas que guían la interpretación del contenido: ¿qué tenemos?, ¿cómo se ha configurado el catálogo?, ¿qué destaca?, ¿la popularidad refleja calidad percibida?, ¿dónde hay oportunidades? y ¿qué decisiones pueden apoyarse con estos hallazgos? Esta lógica facilita la lectura del proyecto y ayuda a que los usuarios entiendan no solo los datos, sino también las decisiones que pueden derivarse de ellos. En definitiva, la narrativa visual actúa como puente entre el análisis exploratorio y la acción estratégica, convirtiendo la información del catálogo en una herramienta útil para la organización.</w:t>
+        <w:t xml:space="preserve">Esta estructura narrativa responde a la necesidad de comunicar con claridad a distintas audiencias. Para el Directorio, la historia debe centrarse en una visión general del catálogo, sus tendencias principales y las oportunidades estratégicas que este presenta; para la Gerencia de Contenidos y Adquisición, debe profundizar en la composición del catálogo, los géneros predominantes y la procedencia de los contenidos; y para la Gerencia de Marketing, debe enfatizar los títulos y segmentos con mayor potencial de posicionamiento, visibilidad y promoción. De esta forma, la narrativa visual adapta el mismo conjunto de datos a distintos niveles de análisis sin perder consistencia ni propósito.</w:t>
+      </w:r>
+    </w:p>
+    <w:p>
+      <w:pPr>
+        <w:rPr/>
+      </w:pPr>
+      <w:r>
+        <w:rPr>
+          <w:rtl w:val="0"/>
+        </w:rPr>
+        <w:t xml:space="preserve">La historia visual se construye a partir de una secuencia de preguntas que guían la interpretación del contenido: ¿qué tenemos?, ¿cómo se ha configurado el catálogo?, ¿qué destaca?, ¿la popularidad refleja calidad percibida?, ¿dónde hay oportunidades? y ¿qué decisiones pueden apoyarse con estos hallazgos? Esta lógica facilita la lectura del proyecto y ayuda a que los usuarios entiendan no solo los datos, sino también las decisiones que pueden derivarse de ellos. El análisis se basa en un catálogo ya limpio, validado y integrado, por lo que la narrativa no recae sobre problemas estructurales del dato, sino sobre patrones de negocio observables y accionables.</w:t>
+      </w:r>
+    </w:p>
+    <w:p>
+      <w:pPr>
+        <w:rPr/>
+      </w:pPr>
+      <w:r>
+        <w:rPr>
+          <w:rtl w:val="0"/>
+        </w:rPr>
+        <w:t xml:space="preserve">En definitiva, la narrativa visual actúa como puente entre el análisis exploratorio y la acción estratégica, convirtiendo la información del catálogo en una herramienta útil para la organización. La historia no solo explica qué está ocurriendo en el portafolio de contenido, sino que también orienta decisiones sobre adquisición, promoción, segmentación y equilibrio estratégico del catálogo.</w:t>
       </w:r>
       <w:r>
         <w:rPr>
@@ -5657,18 +6787,18 @@
         <w:rPr>
           <w:rtl w:val="0"/>
         </w:rPr>
-        <w:t xml:space="preserve">El dashboard interactivo se desarrolla como una capa de comunicación visual que permite explorar el catálogo audiovisual de StreamView Analytics de forma intuitiva y con un enfoque orientado a la toma de decisiones. A partir del dataset limpio previamente consolidado, esta herramienta busca transformar la información del catálogo en indicadores clave, comparaciones visuales y filtros interactivos que permitan analizar la composición del contenido, identificar tendencias y detectar oportunidades relevantes para la organización.</w:t>
-      </w:r>
-    </w:p>
-    <w:p>
-      <w:pPr>
-        <w:rPr/>
-      </w:pPr>
-      <w:r>
-        <w:rPr>
-          <w:rtl w:val="0"/>
-        </w:rPr>
-        <w:t xml:space="preserve">La implementación en Data Studio se fundamenta en la idea de ofrecer una experiencia exploratoria para distintas audiencias. Para el Directorio, el dashboard debe priorizar indicadores ejecutivos y una visión general del catálogo; para la Gerencia de Contenidos y Adquisición, debe permitir profundizar en géneros, países, idiomas y evolución del contenido; y para la Gerencia de Marketing, debe centrarse en contenidos con mayor potencial de promoción y posicionamiento. La estructura del dashboard estará diseñada para responder a estas necesidades mediante filtros, métricas resumidas y visualizaciones comparativas adaptadas a cada nivel de decisión.</w:t>
+        <w:t xml:space="preserve">El dashboard interactivo se desarrolla como una capa final de comunicación visual que permite explorar el catálogo audiovisual de StreamView Analytics de forma intuitiva y con un enfoque orientado a la toma de decisiones. A partir del dataset limpio y validado previamente, esta herramienta busca transformar la información del catálogo en indicadores clave, comparaciones visuales y filtros interactivos que permitan analizar la composición del contenido, identificar tendencias y detectar oportunidades relevantes para la organización.</w:t>
+      </w:r>
+    </w:p>
+    <w:p>
+      <w:pPr>
+        <w:rPr/>
+      </w:pPr>
+      <w:r>
+        <w:rPr>
+          <w:rtl w:val="0"/>
+        </w:rPr>
+        <w:t xml:space="preserve">La implementación en Looker Studio se fundamenta en la idea de ofrecer una experiencia exploratoria para distintas audiencias. Para el Directorio, el dashboard debe priorizar indicadores ejecutivos y una visión general del catálogo; para la Gerencia de Contenidos y Adquisición, debe permitir profundizar en géneros, países, idiomas y evolución del contenido; y para la Gerencia de Marketing, debe centrarse en contenidos con mayor potencial de promoción, posicionamiento y visibilidad. La estructura del dashboard estará diseñada para responder a estas necesidades mediante filtros, métricas resumidas y visualizaciones comparativas adaptadas a cada nivel de decisión.</w:t>
       </w:r>
     </w:p>
     <w:p>
@@ -5690,7 +6820,7 @@
         <w:rPr>
           <w:rtl w:val="0"/>
         </w:rPr>
-        <w:t xml:space="preserve">La consolidación del dataset limpio como base para la visualización garantiza que los indicadores presentados sean consistentes, comparables y confiables. De esta manera, el dashboard se convierte en una herramienta analítica que complementa el proceso de limpieza, integración y análisis exploratorio, cerrando el ciclo de preparación de datos y comunicación visual del proyecto.</w:t>
+        <w:t xml:space="preserve">La consolidación del dataset limpio como base para la visualización garantiza que los indicadores presentados sean consistentes, comparables y confiables. De esta manera, el dashboard se convierte en una herramienta analítica que complementa el proceso de limpieza, integración y análisis exploratorio, cerrando el ciclo de preparación de datos y comunicación visual del proyecto. Su propósito final no es solo mostrar resultados, sino facilitar la interpretación del portafolio de contenido y apoyar decisiones con mayor fundamento analítico.</w:t>
       </w:r>
       <w:r>
         <w:rPr>
@@ -5726,18 +6856,28 @@
         <w:rPr>
           <w:rtl w:val="0"/>
         </w:rPr>
-        <w:t xml:space="preserve">La solución desarrollada para StreamView Analytics presenta una base sólida para el análisis del catálogo audiovisual, ya que integra información de películas y series en un dataset coherente, facilita la exploración visual y permite responder preguntas clave sobre composición, evolución y relevancia del contenido. Entre sus principales fortalezas se encuentra la posibilidad de analizar el catálogo de manera unificada, identificar patrones por género, país, idioma y periodo temporal, y comunicar estos hallazgos a distintas audiencias mediante una narrativa visual clara y estructurada. Además, el uso de un dataset limpio y consolidado mejora la confiabilidad de los indicadores utilizados en la toma de decisiones.</w:t>
-      </w:r>
-    </w:p>
-    <w:p>
-      <w:pPr>
-        <w:rPr/>
-      </w:pPr>
-      <w:r>
-        <w:rPr>
-          <w:rtl w:val="0"/>
-        </w:rPr>
-        <w:t xml:space="preserve">No obstante, la solución también presenta limitaciones relevantes que deben reconocerse. En primer lugar, la disponibilidad de datos no siempre es uniforme para todas las variables: algunos campos presentan mayor cobertura que otros, especialmente en indicadores financieros y atributos asociados a determinadas producciones. Esto puede restringir la comparabilidad entre ciertos segmentos del catálogo y exige un tratamiento cuidadoso al interpretar los resultados. Asimismo, la variable popularity debe entenderse como un índice relativo y no como una medida directa de consumo, lo que requiere un criterio analítico claro para evitar interpretaciones erróneas.</w:t>
+        <w:t xml:space="preserve">La solución desarrollada para StreamView Analytics presenta una base sólida para el análisis del catálogo audiovisual, ya que integra información de películas y series en un dataset coherente, facilita la exploración visual y permite responder preguntas clave sobre composición, evolución y relevancia del contenido. Entre sus principales fortalezas se encuentra la posibilidad de analizar el catálogo de manera unificada, identificar patrones por género, país, idioma y periodo temporal, y comunicar estos hallazgos a distintas audiencias mediante una narrativa visual clara y estructurada. Además, el uso de un dataset limpio, validado y consolidado mejora la confiabilidad de los indicadores utilizados en la toma de decisiones.</w:t>
+      </w:r>
+    </w:p>
+    <w:p>
+      <w:pPr>
+        <w:rPr/>
+      </w:pPr>
+      <w:r>
+        <w:rPr>
+          <w:rtl w:val="0"/>
+        </w:rPr>
+      </w:r>
+    </w:p>
+    <w:p>
+      <w:pPr>
+        <w:rPr/>
+      </w:pPr>
+      <w:r>
+        <w:rPr>
+          <w:rtl w:val="0"/>
+        </w:rPr>
+        <w:t xml:space="preserve">No obstante, la solución también presenta limitaciones relevantes que deben reconocerse. En primer lugar, la disponibilidad de datos no siempre es uniforme para todas las variables: algunos campos presentan mayor cobertura que otros, especialmente en indicadores financieros y atributos asociados a determinadas producciones. Esto puede restringir la comparabilidad entre ciertos segmentos del catálogo y exige un tratamiento cuidadoso al interpretar los resultados. Asimismo, la variable popularity debe entenderse como un índice relativo y no como una medida directa de consumo, por lo que su interpretación debe hacerse con criterio analítico para evitar conclusiones erróneas.</w:t>
       </w:r>
     </w:p>
     <w:p>
@@ -5759,7 +6899,7 @@
         <w:rPr>
           <w:rtl w:val="0"/>
         </w:rPr>
-        <w:t xml:space="preserve">Entre las oportunidades de mejora se encuentra la posibilidad de incorporar más variables de contexto para enriquecer el análisis, como clasificaciones por género más específicas, segmentación geográfica detallada o indicadores de rendimiento por contenido. También podría ampliarse la narrativa visual para incluir recomendaciones más accionables para la Gerencia de Contenidos y Marketing. En términos de diseño, el dashboard interactivo puede mejorar su capacidad exploratoria mediante filtros más avanzados, comparaciones entre periodos y visualizaciones orientadas a decisiones concretas. Estas mejoras permitirían fortalecer la solución y convertirla en una herramienta aún más útil para la organización.</w:t>
+        <w:t xml:space="preserve">Entre las oportunidades de mejora se encuentra la posibilidad de incorporar más variables de contexto para enriquecer el análisis, como clasificaciones por género más específicas, segmentación geográfica más detallada o indicadores de rendimiento por contenido. También podría ampliarse la narrativa visual para incluir recomendaciones más accionables para la Gerencia de Contenidos y Marketing. En términos de diseño, el dashboard interactivo puede mejorar su capacidad exploratoria mediante filtros más avanzados, comparaciones entre periodos y visualizaciones orientadas a decisiones concretas. Estas mejoras permitirían fortalecer la solución y convertirla en una herramienta aún más útil para la organización, ampliando su valor como recurso de análisis estratégico y comunicación visual.</w:t>
       </w:r>
       <w:r>
         <w:rPr>
@@ -5811,18 +6951,18 @@
         <w:rPr>
           <w:rtl w:val="0"/>
         </w:rPr>
-        <w:t xml:space="preserve">La solución desarrollada permite transformar el catálogo audiovisual de StreamView Analytics en una fuente de información organizada, analizable y comprensible para la toma de decisiones. A lo largo del proyecto, se evidenció que la limpieza y consolidación de los datos es un paso fundamental, ya que permite evitar inconsistencias, facilitar comparaciones entre películas y series y garantizar que los indicadores calculados reflejen la realidad del catálogo. Esta base analítica es indispensable para que los hallazgos visuales sean útiles para la organización y no solo descriptivos.</w:t>
-      </w:r>
-    </w:p>
-    <w:p>
-      <w:pPr>
-        <w:rPr/>
-      </w:pPr>
-      <w:r>
-        <w:rPr>
-          <w:rtl w:val="0"/>
-        </w:rPr>
-        <w:t xml:space="preserve">Uno de los principales hallazgos del análisis es que el catálogo presenta una composición diversa en términos de géneros, países, idiomas y evolución temporal. Esta diversidad representa una oportunidad para la organización, pero también exige una gestión rigurosa del contenido para identificar los segmentos con mayor relevancia y potencial estratégico. Asimismo, la relación entre popularidad y valoración sugiere que no siempre los contenidos más visibles son los mejor percibidos por la audiencia, lo que resulta relevante para la planificación de promociones, adquisiciones y posicionamiento de contenido.</w:t>
+        <w:t xml:space="preserve">La solución desarrollada permite transformar el catálogo audiovisual de StreamView Analytics en una fuente de información organizada, analizable y comprensible para la toma de decisiones. A lo largo del proyecto, se evidenció que la limpieza y consolidación de los datos es un paso fundamental, ya que permite evitar inconsistencias, facilitar comparaciones entre películas y series y garantizar que los indicadores calculados reflejan la realidad del catálogo. Esta base analítica es indispensable para que los hallazgos visuales sean útiles para la organización y no sólo descriptivos.</w:t>
+      </w:r>
+    </w:p>
+    <w:p>
+      <w:pPr>
+        <w:rPr/>
+      </w:pPr>
+      <w:r>
+        <w:rPr>
+          <w:rtl w:val="0"/>
+        </w:rPr>
+        <w:t xml:space="preserve">Uno de los principales hallazgos del análisis es que el catálogo presenta una composición diversa en términos de géneros, países, idiomas y evolución temporal. Esta diversidad representa una oportunidad para la organización, pero también exige una gestión rigurosa del contenido para identificar los segmentos con mayor relevancia y potencial estratégico. Asimismo, la relación entre popularidad y valoración sugiere que no siempre los contenidos más visibles son los mejor percibidos por la audiencia, lo que resulta relevante para la planificación de promociones, adquisiciones y posicionamiento del contenido.</w:t>
       </w:r>
     </w:p>
     <w:p>
@@ -5856,16 +6996,6 @@
           <w:rtl w:val="0"/>
         </w:rPr>
         <w:t xml:space="preserve">En conclusión, la solución desarrollada cumple con el objetivo de convertir el catálogo audiovisual en una herramienta analítica útil para la organización. Su valor principal radica en facilitar la comprensión del inventario, identificar oportunidades estratégicas y apoyar decisiones basadas en evidencia. Si se complementa con mejoras analíticas y de diseño, la propuesta puede consolidarse como una herramienta más robusta y de mayor impacto para la toma de decisiones en StreamView Analytics.</w:t>
-      </w:r>
-    </w:p>
-    <w:p>
-      <w:pPr>
-        <w:rPr/>
-      </w:pPr>
-      <w:r>
-        <w:rPr>
-          <w:rtl w:val="0"/>
-        </w:rPr>
       </w:r>
     </w:p>
     <w:p>
@@ -6137,12 +7267,12 @@
           <wp:extent cx="932815" cy="231775"/>
           <wp:effectExtent b="0" l="0" r="0" t="0"/>
           <wp:wrapSquare wrapText="bothSides" distB="0" distT="0" distL="114300" distR="114300"/>
-          <wp:docPr id="2" name="image1.png"/>
+          <wp:docPr id="2" name="image2.png"/>
           <a:graphic>
             <a:graphicData uri="http://schemas.openxmlformats.org/drawingml/2006/picture">
               <pic:pic>
                 <pic:nvPicPr>
-                  <pic:cNvPr id="0" name="image1.png"/>
+                  <pic:cNvPr id="0" name="image2.png"/>
                   <pic:cNvPicPr preferRelativeResize="0"/>
                 </pic:nvPicPr>
                 <pic:blipFill>
@@ -6270,12 +7400,12 @@
         <wp:inline distB="0" distT="0" distL="0" distR="0">
           <wp:extent cx="3057756" cy="673742"/>
           <wp:effectExtent b="0" l="0" r="0" t="0"/>
-          <wp:docPr id="1" name="image2.png"/>
+          <wp:docPr id="1" name="image1.png"/>
           <a:graphic>
             <a:graphicData uri="http://schemas.openxmlformats.org/drawingml/2006/picture">
               <pic:pic>
                 <pic:nvPicPr>
-                  <pic:cNvPr id="0" name="image2.png"/>
+                  <pic:cNvPr id="0" name="image1.png"/>
                   <pic:cNvPicPr preferRelativeResize="0"/>
                 </pic:nvPicPr>
                 <pic:blipFill>
@@ -6530,11 +7660,802 @@
       </w:rPr>
     </w:lvl>
   </w:abstractNum>
+  <w:abstractNum w:abstractNumId="3">
+    <w:lvl w:ilvl="0">
+      <w:start w:val="1"/>
+      <w:numFmt w:val="bullet"/>
+      <w:lvlText w:val="●"/>
+      <w:lvlJc w:val="left"/>
+      <w:pPr>
+        <w:ind w:left="720" w:hanging="360"/>
+      </w:pPr>
+      <w:rPr>
+        <w:u w:val="none"/>
+      </w:rPr>
+    </w:lvl>
+    <w:lvl w:ilvl="1">
+      <w:start w:val="1"/>
+      <w:numFmt w:val="bullet"/>
+      <w:lvlText w:val="○"/>
+      <w:lvlJc w:val="left"/>
+      <w:pPr>
+        <w:ind w:left="1440" w:hanging="360"/>
+      </w:pPr>
+      <w:rPr>
+        <w:u w:val="none"/>
+      </w:rPr>
+    </w:lvl>
+    <w:lvl w:ilvl="2">
+      <w:start w:val="1"/>
+      <w:numFmt w:val="bullet"/>
+      <w:lvlText w:val="■"/>
+      <w:lvlJc w:val="left"/>
+      <w:pPr>
+        <w:ind w:left="2160" w:hanging="360"/>
+      </w:pPr>
+      <w:rPr>
+        <w:u w:val="none"/>
+      </w:rPr>
+    </w:lvl>
+    <w:lvl w:ilvl="3">
+      <w:start w:val="1"/>
+      <w:numFmt w:val="bullet"/>
+      <w:lvlText w:val="●"/>
+      <w:lvlJc w:val="left"/>
+      <w:pPr>
+        <w:ind w:left="2880" w:hanging="360"/>
+      </w:pPr>
+      <w:rPr>
+        <w:u w:val="none"/>
+      </w:rPr>
+    </w:lvl>
+    <w:lvl w:ilvl="4">
+      <w:start w:val="1"/>
+      <w:numFmt w:val="bullet"/>
+      <w:lvlText w:val="○"/>
+      <w:lvlJc w:val="left"/>
+      <w:pPr>
+        <w:ind w:left="3600" w:hanging="360"/>
+      </w:pPr>
+      <w:rPr>
+        <w:u w:val="none"/>
+      </w:rPr>
+    </w:lvl>
+    <w:lvl w:ilvl="5">
+      <w:start w:val="1"/>
+      <w:numFmt w:val="bullet"/>
+      <w:lvlText w:val="■"/>
+      <w:lvlJc w:val="left"/>
+      <w:pPr>
+        <w:ind w:left="4320" w:hanging="360"/>
+      </w:pPr>
+      <w:rPr>
+        <w:u w:val="none"/>
+      </w:rPr>
+    </w:lvl>
+    <w:lvl w:ilvl="6">
+      <w:start w:val="1"/>
+      <w:numFmt w:val="bullet"/>
+      <w:lvlText w:val="●"/>
+      <w:lvlJc w:val="left"/>
+      <w:pPr>
+        <w:ind w:left="5040" w:hanging="360"/>
+      </w:pPr>
+      <w:rPr>
+        <w:u w:val="none"/>
+      </w:rPr>
+    </w:lvl>
+    <w:lvl w:ilvl="7">
+      <w:start w:val="1"/>
+      <w:numFmt w:val="bullet"/>
+      <w:lvlText w:val="○"/>
+      <w:lvlJc w:val="left"/>
+      <w:pPr>
+        <w:ind w:left="5760" w:hanging="360"/>
+      </w:pPr>
+      <w:rPr>
+        <w:u w:val="none"/>
+      </w:rPr>
+    </w:lvl>
+    <w:lvl w:ilvl="8">
+      <w:start w:val="1"/>
+      <w:numFmt w:val="bullet"/>
+      <w:lvlText w:val="■"/>
+      <w:lvlJc w:val="left"/>
+      <w:pPr>
+        <w:ind w:left="6480" w:hanging="360"/>
+      </w:pPr>
+      <w:rPr>
+        <w:u w:val="none"/>
+      </w:rPr>
+    </w:lvl>
+  </w:abstractNum>
+  <w:abstractNum w:abstractNumId="4">
+    <w:lvl w:ilvl="0">
+      <w:start w:val="1"/>
+      <w:numFmt w:val="bullet"/>
+      <w:lvlText w:val="●"/>
+      <w:lvlJc w:val="left"/>
+      <w:pPr>
+        <w:ind w:left="720" w:hanging="360"/>
+      </w:pPr>
+      <w:rPr>
+        <w:u w:val="none"/>
+      </w:rPr>
+    </w:lvl>
+    <w:lvl w:ilvl="1">
+      <w:start w:val="1"/>
+      <w:numFmt w:val="bullet"/>
+      <w:lvlText w:val="○"/>
+      <w:lvlJc w:val="left"/>
+      <w:pPr>
+        <w:ind w:left="1440" w:hanging="360"/>
+      </w:pPr>
+      <w:rPr>
+        <w:u w:val="none"/>
+      </w:rPr>
+    </w:lvl>
+    <w:lvl w:ilvl="2">
+      <w:start w:val="1"/>
+      <w:numFmt w:val="bullet"/>
+      <w:lvlText w:val="■"/>
+      <w:lvlJc w:val="left"/>
+      <w:pPr>
+        <w:ind w:left="2160" w:hanging="360"/>
+      </w:pPr>
+      <w:rPr>
+        <w:u w:val="none"/>
+      </w:rPr>
+    </w:lvl>
+    <w:lvl w:ilvl="3">
+      <w:start w:val="1"/>
+      <w:numFmt w:val="bullet"/>
+      <w:lvlText w:val="●"/>
+      <w:lvlJc w:val="left"/>
+      <w:pPr>
+        <w:ind w:left="2880" w:hanging="360"/>
+      </w:pPr>
+      <w:rPr>
+        <w:u w:val="none"/>
+      </w:rPr>
+    </w:lvl>
+    <w:lvl w:ilvl="4">
+      <w:start w:val="1"/>
+      <w:numFmt w:val="bullet"/>
+      <w:lvlText w:val="○"/>
+      <w:lvlJc w:val="left"/>
+      <w:pPr>
+        <w:ind w:left="3600" w:hanging="360"/>
+      </w:pPr>
+      <w:rPr>
+        <w:u w:val="none"/>
+      </w:rPr>
+    </w:lvl>
+    <w:lvl w:ilvl="5">
+      <w:start w:val="1"/>
+      <w:numFmt w:val="bullet"/>
+      <w:lvlText w:val="■"/>
+      <w:lvlJc w:val="left"/>
+      <w:pPr>
+        <w:ind w:left="4320" w:hanging="360"/>
+      </w:pPr>
+      <w:rPr>
+        <w:u w:val="none"/>
+      </w:rPr>
+    </w:lvl>
+    <w:lvl w:ilvl="6">
+      <w:start w:val="1"/>
+      <w:numFmt w:val="bullet"/>
+      <w:lvlText w:val="●"/>
+      <w:lvlJc w:val="left"/>
+      <w:pPr>
+        <w:ind w:left="5040" w:hanging="360"/>
+      </w:pPr>
+      <w:rPr>
+        <w:u w:val="none"/>
+      </w:rPr>
+    </w:lvl>
+    <w:lvl w:ilvl="7">
+      <w:start w:val="1"/>
+      <w:numFmt w:val="bullet"/>
+      <w:lvlText w:val="○"/>
+      <w:lvlJc w:val="left"/>
+      <w:pPr>
+        <w:ind w:left="5760" w:hanging="360"/>
+      </w:pPr>
+      <w:rPr>
+        <w:u w:val="none"/>
+      </w:rPr>
+    </w:lvl>
+    <w:lvl w:ilvl="8">
+      <w:start w:val="1"/>
+      <w:numFmt w:val="bullet"/>
+      <w:lvlText w:val="■"/>
+      <w:lvlJc w:val="left"/>
+      <w:pPr>
+        <w:ind w:left="6480" w:hanging="360"/>
+      </w:pPr>
+      <w:rPr>
+        <w:u w:val="none"/>
+      </w:rPr>
+    </w:lvl>
+  </w:abstractNum>
+  <w:abstractNum w:abstractNumId="5">
+    <w:lvl w:ilvl="0">
+      <w:start w:val="1"/>
+      <w:numFmt w:val="bullet"/>
+      <w:lvlText w:val="●"/>
+      <w:lvlJc w:val="left"/>
+      <w:pPr>
+        <w:ind w:left="720" w:hanging="360"/>
+      </w:pPr>
+      <w:rPr>
+        <w:u w:val="none"/>
+      </w:rPr>
+    </w:lvl>
+    <w:lvl w:ilvl="1">
+      <w:start w:val="1"/>
+      <w:numFmt w:val="bullet"/>
+      <w:lvlText w:val="○"/>
+      <w:lvlJc w:val="left"/>
+      <w:pPr>
+        <w:ind w:left="1440" w:hanging="360"/>
+      </w:pPr>
+      <w:rPr>
+        <w:u w:val="none"/>
+      </w:rPr>
+    </w:lvl>
+    <w:lvl w:ilvl="2">
+      <w:start w:val="1"/>
+      <w:numFmt w:val="bullet"/>
+      <w:lvlText w:val="■"/>
+      <w:lvlJc w:val="left"/>
+      <w:pPr>
+        <w:ind w:left="2160" w:hanging="360"/>
+      </w:pPr>
+      <w:rPr>
+        <w:u w:val="none"/>
+      </w:rPr>
+    </w:lvl>
+    <w:lvl w:ilvl="3">
+      <w:start w:val="1"/>
+      <w:numFmt w:val="bullet"/>
+      <w:lvlText w:val="●"/>
+      <w:lvlJc w:val="left"/>
+      <w:pPr>
+        <w:ind w:left="2880" w:hanging="360"/>
+      </w:pPr>
+      <w:rPr>
+        <w:u w:val="none"/>
+      </w:rPr>
+    </w:lvl>
+    <w:lvl w:ilvl="4">
+      <w:start w:val="1"/>
+      <w:numFmt w:val="bullet"/>
+      <w:lvlText w:val="○"/>
+      <w:lvlJc w:val="left"/>
+      <w:pPr>
+        <w:ind w:left="3600" w:hanging="360"/>
+      </w:pPr>
+      <w:rPr>
+        <w:u w:val="none"/>
+      </w:rPr>
+    </w:lvl>
+    <w:lvl w:ilvl="5">
+      <w:start w:val="1"/>
+      <w:numFmt w:val="bullet"/>
+      <w:lvlText w:val="■"/>
+      <w:lvlJc w:val="left"/>
+      <w:pPr>
+        <w:ind w:left="4320" w:hanging="360"/>
+      </w:pPr>
+      <w:rPr>
+        <w:u w:val="none"/>
+      </w:rPr>
+    </w:lvl>
+    <w:lvl w:ilvl="6">
+      <w:start w:val="1"/>
+      <w:numFmt w:val="bullet"/>
+      <w:lvlText w:val="●"/>
+      <w:lvlJc w:val="left"/>
+      <w:pPr>
+        <w:ind w:left="5040" w:hanging="360"/>
+      </w:pPr>
+      <w:rPr>
+        <w:u w:val="none"/>
+      </w:rPr>
+    </w:lvl>
+    <w:lvl w:ilvl="7">
+      <w:start w:val="1"/>
+      <w:numFmt w:val="bullet"/>
+      <w:lvlText w:val="○"/>
+      <w:lvlJc w:val="left"/>
+      <w:pPr>
+        <w:ind w:left="5760" w:hanging="360"/>
+      </w:pPr>
+      <w:rPr>
+        <w:u w:val="none"/>
+      </w:rPr>
+    </w:lvl>
+    <w:lvl w:ilvl="8">
+      <w:start w:val="1"/>
+      <w:numFmt w:val="bullet"/>
+      <w:lvlText w:val="■"/>
+      <w:lvlJc w:val="left"/>
+      <w:pPr>
+        <w:ind w:left="6480" w:hanging="360"/>
+      </w:pPr>
+      <w:rPr>
+        <w:u w:val="none"/>
+      </w:rPr>
+    </w:lvl>
+  </w:abstractNum>
+  <w:abstractNum w:abstractNumId="6">
+    <w:lvl w:ilvl="0">
+      <w:start w:val="1"/>
+      <w:numFmt w:val="bullet"/>
+      <w:lvlText w:val="●"/>
+      <w:lvlJc w:val="left"/>
+      <w:pPr>
+        <w:ind w:left="720" w:hanging="360"/>
+      </w:pPr>
+      <w:rPr>
+        <w:u w:val="none"/>
+      </w:rPr>
+    </w:lvl>
+    <w:lvl w:ilvl="1">
+      <w:start w:val="1"/>
+      <w:numFmt w:val="bullet"/>
+      <w:lvlText w:val="○"/>
+      <w:lvlJc w:val="left"/>
+      <w:pPr>
+        <w:ind w:left="1440" w:hanging="360"/>
+      </w:pPr>
+      <w:rPr>
+        <w:u w:val="none"/>
+      </w:rPr>
+    </w:lvl>
+    <w:lvl w:ilvl="2">
+      <w:start w:val="1"/>
+      <w:numFmt w:val="bullet"/>
+      <w:lvlText w:val="■"/>
+      <w:lvlJc w:val="left"/>
+      <w:pPr>
+        <w:ind w:left="2160" w:hanging="360"/>
+      </w:pPr>
+      <w:rPr>
+        <w:u w:val="none"/>
+      </w:rPr>
+    </w:lvl>
+    <w:lvl w:ilvl="3">
+      <w:start w:val="1"/>
+      <w:numFmt w:val="bullet"/>
+      <w:lvlText w:val="●"/>
+      <w:lvlJc w:val="left"/>
+      <w:pPr>
+        <w:ind w:left="2880" w:hanging="360"/>
+      </w:pPr>
+      <w:rPr>
+        <w:u w:val="none"/>
+      </w:rPr>
+    </w:lvl>
+    <w:lvl w:ilvl="4">
+      <w:start w:val="1"/>
+      <w:numFmt w:val="bullet"/>
+      <w:lvlText w:val="○"/>
+      <w:lvlJc w:val="left"/>
+      <w:pPr>
+        <w:ind w:left="3600" w:hanging="360"/>
+      </w:pPr>
+      <w:rPr>
+        <w:u w:val="none"/>
+      </w:rPr>
+    </w:lvl>
+    <w:lvl w:ilvl="5">
+      <w:start w:val="1"/>
+      <w:numFmt w:val="bullet"/>
+      <w:lvlText w:val="■"/>
+      <w:lvlJc w:val="left"/>
+      <w:pPr>
+        <w:ind w:left="4320" w:hanging="360"/>
+      </w:pPr>
+      <w:rPr>
+        <w:u w:val="none"/>
+      </w:rPr>
+    </w:lvl>
+    <w:lvl w:ilvl="6">
+      <w:start w:val="1"/>
+      <w:numFmt w:val="bullet"/>
+      <w:lvlText w:val="●"/>
+      <w:lvlJc w:val="left"/>
+      <w:pPr>
+        <w:ind w:left="5040" w:hanging="360"/>
+      </w:pPr>
+      <w:rPr>
+        <w:u w:val="none"/>
+      </w:rPr>
+    </w:lvl>
+    <w:lvl w:ilvl="7">
+      <w:start w:val="1"/>
+      <w:numFmt w:val="bullet"/>
+      <w:lvlText w:val="○"/>
+      <w:lvlJc w:val="left"/>
+      <w:pPr>
+        <w:ind w:left="5760" w:hanging="360"/>
+      </w:pPr>
+      <w:rPr>
+        <w:u w:val="none"/>
+      </w:rPr>
+    </w:lvl>
+    <w:lvl w:ilvl="8">
+      <w:start w:val="1"/>
+      <w:numFmt w:val="bullet"/>
+      <w:lvlText w:val="■"/>
+      <w:lvlJc w:val="left"/>
+      <w:pPr>
+        <w:ind w:left="6480" w:hanging="360"/>
+      </w:pPr>
+      <w:rPr>
+        <w:u w:val="none"/>
+      </w:rPr>
+    </w:lvl>
+  </w:abstractNum>
+  <w:abstractNum w:abstractNumId="7">
+    <w:lvl w:ilvl="0">
+      <w:start w:val="1"/>
+      <w:numFmt w:val="bullet"/>
+      <w:lvlText w:val="●"/>
+      <w:lvlJc w:val="left"/>
+      <w:pPr>
+        <w:ind w:left="720" w:hanging="360"/>
+      </w:pPr>
+      <w:rPr>
+        <w:u w:val="none"/>
+      </w:rPr>
+    </w:lvl>
+    <w:lvl w:ilvl="1">
+      <w:start w:val="1"/>
+      <w:numFmt w:val="bullet"/>
+      <w:lvlText w:val="○"/>
+      <w:lvlJc w:val="left"/>
+      <w:pPr>
+        <w:ind w:left="1440" w:hanging="360"/>
+      </w:pPr>
+      <w:rPr>
+        <w:u w:val="none"/>
+      </w:rPr>
+    </w:lvl>
+    <w:lvl w:ilvl="2">
+      <w:start w:val="1"/>
+      <w:numFmt w:val="bullet"/>
+      <w:lvlText w:val="■"/>
+      <w:lvlJc w:val="left"/>
+      <w:pPr>
+        <w:ind w:left="2160" w:hanging="360"/>
+      </w:pPr>
+      <w:rPr>
+        <w:u w:val="none"/>
+      </w:rPr>
+    </w:lvl>
+    <w:lvl w:ilvl="3">
+      <w:start w:val="1"/>
+      <w:numFmt w:val="bullet"/>
+      <w:lvlText w:val="●"/>
+      <w:lvlJc w:val="left"/>
+      <w:pPr>
+        <w:ind w:left="2880" w:hanging="360"/>
+      </w:pPr>
+      <w:rPr>
+        <w:u w:val="none"/>
+      </w:rPr>
+    </w:lvl>
+    <w:lvl w:ilvl="4">
+      <w:start w:val="1"/>
+      <w:numFmt w:val="bullet"/>
+      <w:lvlText w:val="○"/>
+      <w:lvlJc w:val="left"/>
+      <w:pPr>
+        <w:ind w:left="3600" w:hanging="360"/>
+      </w:pPr>
+      <w:rPr>
+        <w:u w:val="none"/>
+      </w:rPr>
+    </w:lvl>
+    <w:lvl w:ilvl="5">
+      <w:start w:val="1"/>
+      <w:numFmt w:val="bullet"/>
+      <w:lvlText w:val="■"/>
+      <w:lvlJc w:val="left"/>
+      <w:pPr>
+        <w:ind w:left="4320" w:hanging="360"/>
+      </w:pPr>
+      <w:rPr>
+        <w:u w:val="none"/>
+      </w:rPr>
+    </w:lvl>
+    <w:lvl w:ilvl="6">
+      <w:start w:val="1"/>
+      <w:numFmt w:val="bullet"/>
+      <w:lvlText w:val="●"/>
+      <w:lvlJc w:val="left"/>
+      <w:pPr>
+        <w:ind w:left="5040" w:hanging="360"/>
+      </w:pPr>
+      <w:rPr>
+        <w:u w:val="none"/>
+      </w:rPr>
+    </w:lvl>
+    <w:lvl w:ilvl="7">
+      <w:start w:val="1"/>
+      <w:numFmt w:val="bullet"/>
+      <w:lvlText w:val="○"/>
+      <w:lvlJc w:val="left"/>
+      <w:pPr>
+        <w:ind w:left="5760" w:hanging="360"/>
+      </w:pPr>
+      <w:rPr>
+        <w:u w:val="none"/>
+      </w:rPr>
+    </w:lvl>
+    <w:lvl w:ilvl="8">
+      <w:start w:val="1"/>
+      <w:numFmt w:val="bullet"/>
+      <w:lvlText w:val="■"/>
+      <w:lvlJc w:val="left"/>
+      <w:pPr>
+        <w:ind w:left="6480" w:hanging="360"/>
+      </w:pPr>
+      <w:rPr>
+        <w:u w:val="none"/>
+      </w:rPr>
+    </w:lvl>
+  </w:abstractNum>
+  <w:abstractNum w:abstractNumId="8">
+    <w:lvl w:ilvl="0">
+      <w:start w:val="1"/>
+      <w:numFmt w:val="bullet"/>
+      <w:lvlText w:val="●"/>
+      <w:lvlJc w:val="left"/>
+      <w:pPr>
+        <w:ind w:left="720" w:hanging="360"/>
+      </w:pPr>
+      <w:rPr>
+        <w:u w:val="none"/>
+      </w:rPr>
+    </w:lvl>
+    <w:lvl w:ilvl="1">
+      <w:start w:val="1"/>
+      <w:numFmt w:val="bullet"/>
+      <w:lvlText w:val="○"/>
+      <w:lvlJc w:val="left"/>
+      <w:pPr>
+        <w:ind w:left="1440" w:hanging="360"/>
+      </w:pPr>
+      <w:rPr>
+        <w:u w:val="none"/>
+      </w:rPr>
+    </w:lvl>
+    <w:lvl w:ilvl="2">
+      <w:start w:val="1"/>
+      <w:numFmt w:val="bullet"/>
+      <w:lvlText w:val="■"/>
+      <w:lvlJc w:val="left"/>
+      <w:pPr>
+        <w:ind w:left="2160" w:hanging="360"/>
+      </w:pPr>
+      <w:rPr>
+        <w:u w:val="none"/>
+      </w:rPr>
+    </w:lvl>
+    <w:lvl w:ilvl="3">
+      <w:start w:val="1"/>
+      <w:numFmt w:val="bullet"/>
+      <w:lvlText w:val="●"/>
+      <w:lvlJc w:val="left"/>
+      <w:pPr>
+        <w:ind w:left="2880" w:hanging="360"/>
+      </w:pPr>
+      <w:rPr>
+        <w:u w:val="none"/>
+      </w:rPr>
+    </w:lvl>
+    <w:lvl w:ilvl="4">
+      <w:start w:val="1"/>
+      <w:numFmt w:val="bullet"/>
+      <w:lvlText w:val="○"/>
+      <w:lvlJc w:val="left"/>
+      <w:pPr>
+        <w:ind w:left="3600" w:hanging="360"/>
+      </w:pPr>
+      <w:rPr>
+        <w:u w:val="none"/>
+      </w:rPr>
+    </w:lvl>
+    <w:lvl w:ilvl="5">
+      <w:start w:val="1"/>
+      <w:numFmt w:val="bullet"/>
+      <w:lvlText w:val="■"/>
+      <w:lvlJc w:val="left"/>
+      <w:pPr>
+        <w:ind w:left="4320" w:hanging="360"/>
+      </w:pPr>
+      <w:rPr>
+        <w:u w:val="none"/>
+      </w:rPr>
+    </w:lvl>
+    <w:lvl w:ilvl="6">
+      <w:start w:val="1"/>
+      <w:numFmt w:val="bullet"/>
+      <w:lvlText w:val="●"/>
+      <w:lvlJc w:val="left"/>
+      <w:pPr>
+        <w:ind w:left="5040" w:hanging="360"/>
+      </w:pPr>
+      <w:rPr>
+        <w:u w:val="none"/>
+      </w:rPr>
+    </w:lvl>
+    <w:lvl w:ilvl="7">
+      <w:start w:val="1"/>
+      <w:numFmt w:val="bullet"/>
+      <w:lvlText w:val="○"/>
+      <w:lvlJc w:val="left"/>
+      <w:pPr>
+        <w:ind w:left="5760" w:hanging="360"/>
+      </w:pPr>
+      <w:rPr>
+        <w:u w:val="none"/>
+      </w:rPr>
+    </w:lvl>
+    <w:lvl w:ilvl="8">
+      <w:start w:val="1"/>
+      <w:numFmt w:val="bullet"/>
+      <w:lvlText w:val="■"/>
+      <w:lvlJc w:val="left"/>
+      <w:pPr>
+        <w:ind w:left="6480" w:hanging="360"/>
+      </w:pPr>
+      <w:rPr>
+        <w:u w:val="none"/>
+      </w:rPr>
+    </w:lvl>
+  </w:abstractNum>
+  <w:abstractNum w:abstractNumId="9">
+    <w:lvl w:ilvl="0">
+      <w:start w:val="1"/>
+      <w:numFmt w:val="bullet"/>
+      <w:lvlText w:val="●"/>
+      <w:lvlJc w:val="left"/>
+      <w:pPr>
+        <w:ind w:left="720" w:hanging="360"/>
+      </w:pPr>
+      <w:rPr>
+        <w:u w:val="none"/>
+      </w:rPr>
+    </w:lvl>
+    <w:lvl w:ilvl="1">
+      <w:start w:val="1"/>
+      <w:numFmt w:val="bullet"/>
+      <w:lvlText w:val="○"/>
+      <w:lvlJc w:val="left"/>
+      <w:pPr>
+        <w:ind w:left="1440" w:hanging="360"/>
+      </w:pPr>
+      <w:rPr>
+        <w:u w:val="none"/>
+      </w:rPr>
+    </w:lvl>
+    <w:lvl w:ilvl="2">
+      <w:start w:val="1"/>
+      <w:numFmt w:val="bullet"/>
+      <w:lvlText w:val="■"/>
+      <w:lvlJc w:val="left"/>
+      <w:pPr>
+        <w:ind w:left="2160" w:hanging="360"/>
+      </w:pPr>
+      <w:rPr>
+        <w:u w:val="none"/>
+      </w:rPr>
+    </w:lvl>
+    <w:lvl w:ilvl="3">
+      <w:start w:val="1"/>
+      <w:numFmt w:val="bullet"/>
+      <w:lvlText w:val="●"/>
+      <w:lvlJc w:val="left"/>
+      <w:pPr>
+        <w:ind w:left="2880" w:hanging="360"/>
+      </w:pPr>
+      <w:rPr>
+        <w:u w:val="none"/>
+      </w:rPr>
+    </w:lvl>
+    <w:lvl w:ilvl="4">
+      <w:start w:val="1"/>
+      <w:numFmt w:val="bullet"/>
+      <w:lvlText w:val="○"/>
+      <w:lvlJc w:val="left"/>
+      <w:pPr>
+        <w:ind w:left="3600" w:hanging="360"/>
+      </w:pPr>
+      <w:rPr>
+        <w:u w:val="none"/>
+      </w:rPr>
+    </w:lvl>
+    <w:lvl w:ilvl="5">
+      <w:start w:val="1"/>
+      <w:numFmt w:val="bullet"/>
+      <w:lvlText w:val="■"/>
+      <w:lvlJc w:val="left"/>
+      <w:pPr>
+        <w:ind w:left="4320" w:hanging="360"/>
+      </w:pPr>
+      <w:rPr>
+        <w:u w:val="none"/>
+      </w:rPr>
+    </w:lvl>
+    <w:lvl w:ilvl="6">
+      <w:start w:val="1"/>
+      <w:numFmt w:val="bullet"/>
+      <w:lvlText w:val="●"/>
+      <w:lvlJc w:val="left"/>
+      <w:pPr>
+        <w:ind w:left="5040" w:hanging="360"/>
+      </w:pPr>
+      <w:rPr>
+        <w:u w:val="none"/>
+      </w:rPr>
+    </w:lvl>
+    <w:lvl w:ilvl="7">
+      <w:start w:val="1"/>
+      <w:numFmt w:val="bullet"/>
+      <w:lvlText w:val="○"/>
+      <w:lvlJc w:val="left"/>
+      <w:pPr>
+        <w:ind w:left="5760" w:hanging="360"/>
+      </w:pPr>
+      <w:rPr>
+        <w:u w:val="none"/>
+      </w:rPr>
+    </w:lvl>
+    <w:lvl w:ilvl="8">
+      <w:start w:val="1"/>
+      <w:numFmt w:val="bullet"/>
+      <w:lvlText w:val="■"/>
+      <w:lvlJc w:val="left"/>
+      <w:pPr>
+        <w:ind w:left="6480" w:hanging="360"/>
+      </w:pPr>
+      <w:rPr>
+        <w:u w:val="none"/>
+      </w:rPr>
+    </w:lvl>
+  </w:abstractNum>
   <w:num w:numId="1">
     <w:abstractNumId w:val="1"/>
   </w:num>
   <w:num w:numId="2">
     <w:abstractNumId w:val="2"/>
+  </w:num>
+  <w:num w:numId="3">
+    <w:abstractNumId w:val="3"/>
+  </w:num>
+  <w:num w:numId="4">
+    <w:abstractNumId w:val="4"/>
+  </w:num>
+  <w:num w:numId="5">
+    <w:abstractNumId w:val="5"/>
+  </w:num>
+  <w:num w:numId="6">
+    <w:abstractNumId w:val="6"/>
+  </w:num>
+  <w:num w:numId="7">
+    <w:abstractNumId w:val="7"/>
+  </w:num>
+  <w:num w:numId="8">
+    <w:abstractNumId w:val="8"/>
+  </w:num>
+  <w:num w:numId="9">
+    <w:abstractNumId w:val="9"/>
   </w:num>
 </w:numbering>
 </file>

</xml_diff>